<commit_message>
feat: update data handling to include soft delete functionality across various components and enhance UI interactions
</commit_message>
<xml_diff>
--- a/Documentacion_Proyecto_Agencia_Viajes.docx
+++ b/Documentacion_Proyecto_Agencia_Viajes.docx
@@ -393,9 +393,10 @@
     <w:p>
       <w:pPr>
         <w:pStyle w:val="Ttulo1"/>
-        <w:spacing w:before="160" w:after="120"/>
-        <w:rPr>
-          <w:rFonts w:ascii="Arial" w:hAnsi="Arial" w:cs="Arial"/>
+        <w:spacing w:before="0" w:after="120"/>
+        <w:jc w:val="both"/>
+        <w:rPr>
+          <w:rFonts w:ascii="Times New Roman" w:hAnsi="Times New Roman" w:cs="Times New Roman"/>
           <w:color w:val="auto"/>
           <w:sz w:val="24"/>
           <w:szCs w:val="24"/>
@@ -403,7 +404,7 @@
       </w:pPr>
       <w:r>
         <w:rPr>
-          <w:rFonts w:ascii="Arial" w:hAnsi="Arial" w:cs="Arial"/>
+          <w:rFonts w:ascii="Times New Roman" w:hAnsi="Times New Roman" w:cs="Times New Roman"/>
           <w:color w:val="auto"/>
           <w:sz w:val="24"/>
           <w:szCs w:val="24"/>
@@ -414,15 +415,16 @@
     </w:p>
     <w:p>
       <w:pPr>
-        <w:rPr>
-          <w:rFonts w:ascii="Arial" w:hAnsi="Arial" w:cs="Arial"/>
-          <w:sz w:val="24"/>
-          <w:szCs w:val="24"/>
-        </w:rPr>
-      </w:pPr>
-      <w:r>
-        <w:rPr>
-          <w:rFonts w:ascii="Arial" w:hAnsi="Arial" w:cs="Arial"/>
+        <w:jc w:val="both"/>
+        <w:rPr>
+          <w:rFonts w:ascii="Times New Roman" w:hAnsi="Times New Roman" w:cs="Times New Roman"/>
+          <w:sz w:val="24"/>
+          <w:szCs w:val="24"/>
+        </w:rPr>
+      </w:pPr>
+      <w:r>
+        <w:rPr>
+          <w:rFonts w:ascii="Times New Roman" w:hAnsi="Times New Roman" w:cs="Times New Roman"/>
           <w:sz w:val="24"/>
           <w:szCs w:val="24"/>
         </w:rPr>
@@ -430,7 +432,7 @@
       </w:r>
       <w:r>
         <w:rPr>
-          <w:rFonts w:ascii="Arial" w:hAnsi="Arial" w:cs="Arial"/>
+          <w:rFonts w:ascii="Times New Roman" w:hAnsi="Times New Roman" w:cs="Times New Roman"/>
           <w:sz w:val="24"/>
           <w:szCs w:val="24"/>
         </w:rPr>
@@ -438,7 +440,7 @@
       </w:r>
       <w:r>
         <w:rPr>
-          <w:rFonts w:ascii="Arial" w:hAnsi="Arial" w:cs="Arial"/>
+          <w:rFonts w:ascii="Times New Roman" w:hAnsi="Times New Roman" w:cs="Times New Roman"/>
           <w:sz w:val="24"/>
           <w:szCs w:val="24"/>
         </w:rPr>
@@ -446,7 +448,7 @@
       </w:r>
       <w:r>
         <w:rPr>
-          <w:rFonts w:ascii="Arial" w:hAnsi="Arial" w:cs="Arial"/>
+          <w:rFonts w:ascii="Times New Roman" w:hAnsi="Times New Roman" w:cs="Times New Roman"/>
           <w:sz w:val="24"/>
           <w:szCs w:val="24"/>
         </w:rPr>
@@ -454,7 +456,7 @@
       </w:r>
       <w:r>
         <w:rPr>
-          <w:rFonts w:ascii="Arial" w:hAnsi="Arial" w:cs="Arial"/>
+          <w:rFonts w:ascii="Times New Roman" w:hAnsi="Times New Roman" w:cs="Times New Roman"/>
           <w:sz w:val="24"/>
           <w:szCs w:val="24"/>
         </w:rPr>
@@ -462,7 +464,7 @@
       </w:r>
       <w:r>
         <w:rPr>
-          <w:rFonts w:ascii="Arial" w:hAnsi="Arial" w:cs="Arial"/>
+          <w:rFonts w:ascii="Times New Roman" w:hAnsi="Times New Roman" w:cs="Times New Roman"/>
           <w:sz w:val="24"/>
           <w:szCs w:val="24"/>
         </w:rPr>
@@ -470,7 +472,7 @@
       </w:r>
       <w:r>
         <w:rPr>
-          <w:rFonts w:ascii="Arial" w:hAnsi="Arial" w:cs="Arial"/>
+          <w:rFonts w:ascii="Times New Roman" w:hAnsi="Times New Roman" w:cs="Times New Roman"/>
           <w:sz w:val="24"/>
           <w:szCs w:val="24"/>
         </w:rPr>
@@ -478,7 +480,7 @@
       </w:r>
       <w:r>
         <w:rPr>
-          <w:rFonts w:ascii="Arial" w:hAnsi="Arial" w:cs="Arial"/>
+          <w:rFonts w:ascii="Times New Roman" w:hAnsi="Times New Roman" w:cs="Times New Roman"/>
           <w:sz w:val="24"/>
           <w:szCs w:val="24"/>
         </w:rPr>
@@ -486,7 +488,7 @@
       </w:r>
       <w:r>
         <w:rPr>
-          <w:rFonts w:ascii="Arial" w:hAnsi="Arial" w:cs="Arial"/>
+          <w:rFonts w:ascii="Times New Roman" w:hAnsi="Times New Roman" w:cs="Times New Roman"/>
           <w:sz w:val="24"/>
           <w:szCs w:val="24"/>
         </w:rPr>
@@ -494,7 +496,7 @@
       </w:r>
       <w:r>
         <w:rPr>
-          <w:rFonts w:ascii="Arial" w:hAnsi="Arial" w:cs="Arial"/>
+          <w:rFonts w:ascii="Times New Roman" w:hAnsi="Times New Roman" w:cs="Times New Roman"/>
           <w:sz w:val="24"/>
           <w:szCs w:val="24"/>
         </w:rPr>
@@ -502,7 +504,7 @@
       </w:r>
       <w:r>
         <w:rPr>
-          <w:rFonts w:ascii="Arial" w:hAnsi="Arial" w:cs="Arial"/>
+          <w:rFonts w:ascii="Times New Roman" w:hAnsi="Times New Roman" w:cs="Times New Roman"/>
           <w:sz w:val="24"/>
           <w:szCs w:val="24"/>
         </w:rPr>
@@ -510,7 +512,7 @@
       </w:r>
       <w:r>
         <w:rPr>
-          <w:rFonts w:ascii="Arial" w:hAnsi="Arial" w:cs="Arial"/>
+          <w:rFonts w:ascii="Times New Roman" w:hAnsi="Times New Roman" w:cs="Times New Roman"/>
           <w:sz w:val="24"/>
           <w:szCs w:val="24"/>
         </w:rPr>
@@ -518,7 +520,7 @@
       </w:r>
       <w:r>
         <w:rPr>
-          <w:rFonts w:ascii="Arial" w:hAnsi="Arial" w:cs="Arial"/>
+          <w:rFonts w:ascii="Times New Roman" w:hAnsi="Times New Roman" w:cs="Times New Roman"/>
           <w:sz w:val="24"/>
           <w:szCs w:val="24"/>
         </w:rPr>
@@ -527,15 +529,16 @@
     </w:p>
     <w:p>
       <w:pPr>
-        <w:rPr>
-          <w:rFonts w:ascii="Arial" w:hAnsi="Arial" w:cs="Arial"/>
-          <w:sz w:val="24"/>
-          <w:szCs w:val="24"/>
-        </w:rPr>
-      </w:pPr>
-      <w:r>
-        <w:rPr>
-          <w:rFonts w:ascii="Arial" w:hAnsi="Arial" w:cs="Arial"/>
+        <w:jc w:val="both"/>
+        <w:rPr>
+          <w:rFonts w:ascii="Times New Roman" w:hAnsi="Times New Roman" w:cs="Times New Roman"/>
+          <w:sz w:val="24"/>
+          <w:szCs w:val="24"/>
+        </w:rPr>
+      </w:pPr>
+      <w:r>
+        <w:rPr>
+          <w:rFonts w:ascii="Times New Roman" w:hAnsi="Times New Roman" w:cs="Times New Roman"/>
           <w:sz w:val="24"/>
           <w:szCs w:val="24"/>
         </w:rPr>
@@ -543,7 +546,7 @@
       </w:r>
       <w:r>
         <w:rPr>
-          <w:rFonts w:ascii="Arial" w:hAnsi="Arial" w:cs="Arial"/>
+          <w:rFonts w:ascii="Times New Roman" w:hAnsi="Times New Roman" w:cs="Times New Roman"/>
           <w:sz w:val="24"/>
           <w:szCs w:val="24"/>
         </w:rPr>
@@ -551,7 +554,7 @@
       </w:r>
       <w:r>
         <w:rPr>
-          <w:rFonts w:ascii="Arial" w:hAnsi="Arial" w:cs="Arial"/>
+          <w:rFonts w:ascii="Times New Roman" w:hAnsi="Times New Roman" w:cs="Times New Roman"/>
           <w:sz w:val="24"/>
           <w:szCs w:val="24"/>
         </w:rPr>
@@ -559,7 +562,7 @@
       </w:r>
       <w:r>
         <w:rPr>
-          <w:rFonts w:ascii="Arial" w:hAnsi="Arial" w:cs="Arial"/>
+          <w:rFonts w:ascii="Times New Roman" w:hAnsi="Times New Roman" w:cs="Times New Roman"/>
           <w:sz w:val="24"/>
           <w:szCs w:val="24"/>
         </w:rPr>
@@ -567,7 +570,7 @@
       </w:r>
       <w:r>
         <w:rPr>
-          <w:rFonts w:ascii="Arial" w:hAnsi="Arial" w:cs="Arial"/>
+          <w:rFonts w:ascii="Times New Roman" w:hAnsi="Times New Roman" w:cs="Times New Roman"/>
           <w:sz w:val="24"/>
           <w:szCs w:val="24"/>
         </w:rPr>
@@ -575,7 +578,7 @@
       </w:r>
       <w:r>
         <w:rPr>
-          <w:rFonts w:ascii="Arial" w:hAnsi="Arial" w:cs="Arial"/>
+          <w:rFonts w:ascii="Times New Roman" w:hAnsi="Times New Roman" w:cs="Times New Roman"/>
           <w:sz w:val="24"/>
           <w:szCs w:val="24"/>
         </w:rPr>
@@ -583,7 +586,7 @@
       </w:r>
       <w:r>
         <w:rPr>
-          <w:rFonts w:ascii="Arial" w:hAnsi="Arial" w:cs="Arial"/>
+          <w:rFonts w:ascii="Times New Roman" w:hAnsi="Times New Roman" w:cs="Times New Roman"/>
           <w:sz w:val="24"/>
           <w:szCs w:val="24"/>
         </w:rPr>
@@ -593,9 +596,10 @@
     <w:p>
       <w:pPr>
         <w:pStyle w:val="Ttulo2"/>
-        <w:spacing w:before="80" w:after="120"/>
-        <w:rPr>
-          <w:rFonts w:ascii="Arial" w:hAnsi="Arial" w:cs="Arial"/>
+        <w:spacing w:before="0" w:after="120"/>
+        <w:jc w:val="both"/>
+        <w:rPr>
+          <w:rFonts w:ascii="Times New Roman" w:hAnsi="Times New Roman" w:cs="Times New Roman"/>
           <w:color w:val="auto"/>
           <w:sz w:val="24"/>
           <w:szCs w:val="24"/>
@@ -603,7 +607,7 @@
       </w:pPr>
       <w:r>
         <w:rPr>
-          <w:rFonts w:ascii="Arial" w:hAnsi="Arial" w:cs="Arial"/>
+          <w:rFonts w:ascii="Times New Roman" w:hAnsi="Times New Roman" w:cs="Times New Roman"/>
           <w:color w:val="auto"/>
           <w:sz w:val="24"/>
           <w:szCs w:val="24"/>
@@ -613,15 +617,16 @@
     </w:p>
     <w:p>
       <w:pPr>
-        <w:rPr>
-          <w:rFonts w:ascii="Arial" w:hAnsi="Arial" w:cs="Arial"/>
-          <w:sz w:val="24"/>
-          <w:szCs w:val="24"/>
-        </w:rPr>
-      </w:pPr>
-      <w:r>
-        <w:rPr>
-          <w:rFonts w:ascii="Arial" w:hAnsi="Arial" w:cs="Arial"/>
+        <w:jc w:val="both"/>
+        <w:rPr>
+          <w:rFonts w:ascii="Times New Roman" w:hAnsi="Times New Roman" w:cs="Times New Roman"/>
+          <w:sz w:val="24"/>
+          <w:szCs w:val="24"/>
+        </w:rPr>
+      </w:pPr>
+      <w:r>
+        <w:rPr>
+          <w:rFonts w:ascii="Times New Roman" w:hAnsi="Times New Roman" w:cs="Times New Roman"/>
           <w:sz w:val="24"/>
           <w:szCs w:val="24"/>
         </w:rPr>
@@ -629,7 +634,7 @@
       </w:r>
       <w:r>
         <w:rPr>
-          <w:rFonts w:ascii="Arial" w:hAnsi="Arial" w:cs="Arial"/>
+          <w:rFonts w:ascii="Times New Roman" w:hAnsi="Times New Roman" w:cs="Times New Roman"/>
           <w:sz w:val="24"/>
           <w:szCs w:val="24"/>
         </w:rPr>
@@ -637,7 +642,7 @@
       </w:r>
       <w:r>
         <w:rPr>
-          <w:rFonts w:ascii="Arial" w:hAnsi="Arial" w:cs="Arial"/>
+          <w:rFonts w:ascii="Times New Roman" w:hAnsi="Times New Roman" w:cs="Times New Roman"/>
           <w:sz w:val="24"/>
           <w:szCs w:val="24"/>
         </w:rPr>
@@ -645,7 +650,7 @@
       </w:r>
       <w:r>
         <w:rPr>
-          <w:rFonts w:ascii="Arial" w:hAnsi="Arial" w:cs="Arial"/>
+          <w:rFonts w:ascii="Times New Roman" w:hAnsi="Times New Roman" w:cs="Times New Roman"/>
           <w:sz w:val="24"/>
           <w:szCs w:val="24"/>
         </w:rPr>
@@ -653,7 +658,7 @@
       </w:r>
       <w:r>
         <w:rPr>
-          <w:rFonts w:ascii="Arial" w:hAnsi="Arial" w:cs="Arial"/>
+          <w:rFonts w:ascii="Times New Roman" w:hAnsi="Times New Roman" w:cs="Times New Roman"/>
           <w:sz w:val="24"/>
           <w:szCs w:val="24"/>
         </w:rPr>
@@ -661,7 +666,7 @@
       </w:r>
       <w:r>
         <w:rPr>
-          <w:rFonts w:ascii="Arial" w:hAnsi="Arial" w:cs="Arial"/>
+          <w:rFonts w:ascii="Times New Roman" w:hAnsi="Times New Roman" w:cs="Times New Roman"/>
           <w:sz w:val="24"/>
           <w:szCs w:val="24"/>
         </w:rPr>
@@ -669,7 +674,7 @@
       </w:r>
       <w:r>
         <w:rPr>
-          <w:rFonts w:ascii="Arial" w:hAnsi="Arial" w:cs="Arial"/>
+          <w:rFonts w:ascii="Times New Roman" w:hAnsi="Times New Roman" w:cs="Times New Roman"/>
           <w:sz w:val="24"/>
           <w:szCs w:val="24"/>
         </w:rPr>
@@ -679,9 +684,10 @@
     <w:p>
       <w:pPr>
         <w:pStyle w:val="Ttulo1"/>
-        <w:spacing w:before="160" w:after="120"/>
-        <w:rPr>
-          <w:rFonts w:ascii="Arial" w:hAnsi="Arial" w:cs="Arial"/>
+        <w:spacing w:before="0" w:after="120"/>
+        <w:jc w:val="both"/>
+        <w:rPr>
+          <w:rFonts w:ascii="Times New Roman" w:hAnsi="Times New Roman" w:cs="Times New Roman"/>
           <w:color w:val="auto"/>
           <w:sz w:val="24"/>
           <w:szCs w:val="24"/>
@@ -689,7 +695,7 @@
       </w:pPr>
       <w:r>
         <w:rPr>
-          <w:rFonts w:ascii="Arial" w:hAnsi="Arial" w:cs="Arial"/>
+          <w:rFonts w:ascii="Times New Roman" w:hAnsi="Times New Roman" w:cs="Times New Roman"/>
           <w:color w:val="auto"/>
           <w:sz w:val="24"/>
           <w:szCs w:val="24"/>
@@ -700,9 +706,10 @@
     <w:p>
       <w:pPr>
         <w:pStyle w:val="Ttulo2"/>
-        <w:spacing w:before="80" w:after="120"/>
-        <w:rPr>
-          <w:rFonts w:ascii="Arial" w:hAnsi="Arial" w:cs="Arial"/>
+        <w:spacing w:before="0" w:after="120"/>
+        <w:jc w:val="both"/>
+        <w:rPr>
+          <w:rFonts w:ascii="Times New Roman" w:hAnsi="Times New Roman" w:cs="Times New Roman"/>
           <w:color w:val="auto"/>
           <w:sz w:val="24"/>
           <w:szCs w:val="24"/>
@@ -710,34 +717,26 @@
       </w:pPr>
       <w:r>
         <w:rPr>
-          <w:rFonts w:ascii="Arial" w:hAnsi="Arial" w:cs="Arial"/>
+          <w:rFonts w:ascii="Times New Roman" w:hAnsi="Times New Roman" w:cs="Times New Roman"/>
           <w:color w:val="auto"/>
           <w:sz w:val="24"/>
           <w:szCs w:val="24"/>
         </w:rPr>
-        <w:t>Descripción</w:t>
-      </w:r>
-      <w:r>
-        <w:rPr>
-          <w:rFonts w:ascii="Arial" w:hAnsi="Arial" w:cs="Arial"/>
-          <w:color w:val="auto"/>
-          <w:sz w:val="24"/>
-          <w:szCs w:val="24"/>
-        </w:rPr>
-        <w:t xml:space="preserve"> general del sistema</w:t>
+        <w:t>Descripción general del sistema</w:t>
       </w:r>
     </w:p>
     <w:p>
       <w:pPr>
-        <w:rPr>
-          <w:rFonts w:ascii="Arial" w:hAnsi="Arial" w:cs="Arial"/>
-          <w:sz w:val="24"/>
-          <w:szCs w:val="24"/>
-        </w:rPr>
-      </w:pPr>
-      <w:r>
-        <w:rPr>
-          <w:rFonts w:ascii="Arial" w:hAnsi="Arial" w:cs="Arial"/>
+        <w:jc w:val="both"/>
+        <w:rPr>
+          <w:rFonts w:ascii="Times New Roman" w:hAnsi="Times New Roman" w:cs="Times New Roman"/>
+          <w:sz w:val="24"/>
+          <w:szCs w:val="24"/>
+        </w:rPr>
+      </w:pPr>
+      <w:r>
+        <w:rPr>
+          <w:rFonts w:ascii="Times New Roman" w:hAnsi="Times New Roman" w:cs="Times New Roman"/>
           <w:sz w:val="24"/>
           <w:szCs w:val="24"/>
         </w:rPr>
@@ -745,7 +744,7 @@
       </w:r>
       <w:r>
         <w:rPr>
-          <w:rFonts w:ascii="Arial" w:hAnsi="Arial" w:cs="Arial"/>
+          <w:rFonts w:ascii="Times New Roman" w:hAnsi="Times New Roman" w:cs="Times New Roman"/>
           <w:sz w:val="24"/>
           <w:szCs w:val="24"/>
         </w:rPr>
@@ -753,7 +752,7 @@
       </w:r>
       <w:r>
         <w:rPr>
-          <w:rFonts w:ascii="Arial" w:hAnsi="Arial" w:cs="Arial"/>
+          <w:rFonts w:ascii="Times New Roman" w:hAnsi="Times New Roman" w:cs="Times New Roman"/>
           <w:sz w:val="24"/>
           <w:szCs w:val="24"/>
         </w:rPr>
@@ -761,7 +760,7 @@
       </w:r>
       <w:r>
         <w:rPr>
-          <w:rFonts w:ascii="Arial" w:hAnsi="Arial" w:cs="Arial"/>
+          <w:rFonts w:ascii="Times New Roman" w:hAnsi="Times New Roman" w:cs="Times New Roman"/>
           <w:sz w:val="24"/>
           <w:szCs w:val="24"/>
         </w:rPr>
@@ -769,7 +768,7 @@
       </w:r>
       <w:r>
         <w:rPr>
-          <w:rFonts w:ascii="Arial" w:hAnsi="Arial" w:cs="Arial"/>
+          <w:rFonts w:ascii="Times New Roman" w:hAnsi="Times New Roman" w:cs="Times New Roman"/>
           <w:sz w:val="24"/>
           <w:szCs w:val="24"/>
         </w:rPr>
@@ -777,7 +776,7 @@
       </w:r>
       <w:r>
         <w:rPr>
-          <w:rFonts w:ascii="Arial" w:hAnsi="Arial" w:cs="Arial"/>
+          <w:rFonts w:ascii="Times New Roman" w:hAnsi="Times New Roman" w:cs="Times New Roman"/>
           <w:sz w:val="24"/>
           <w:szCs w:val="24"/>
         </w:rPr>
@@ -785,7 +784,7 @@
       </w:r>
       <w:r>
         <w:rPr>
-          <w:rFonts w:ascii="Arial" w:hAnsi="Arial" w:cs="Arial"/>
+          <w:rFonts w:ascii="Times New Roman" w:hAnsi="Times New Roman" w:cs="Times New Roman"/>
           <w:sz w:val="24"/>
           <w:szCs w:val="24"/>
         </w:rPr>
@@ -796,15 +795,16 @@
       <w:pPr>
         <w:pStyle w:val="Listaconvietas"/>
         <w:spacing w:after="40"/>
-        <w:rPr>
-          <w:rFonts w:ascii="Arial" w:hAnsi="Arial" w:cs="Arial"/>
-          <w:sz w:val="24"/>
-          <w:szCs w:val="24"/>
-        </w:rPr>
-      </w:pPr>
-      <w:r>
-        <w:rPr>
-          <w:rFonts w:ascii="Arial" w:hAnsi="Arial" w:cs="Arial"/>
+        <w:jc w:val="both"/>
+        <w:rPr>
+          <w:rFonts w:ascii="Times New Roman" w:hAnsi="Times New Roman" w:cs="Times New Roman"/>
+          <w:sz w:val="24"/>
+          <w:szCs w:val="24"/>
+        </w:rPr>
+      </w:pPr>
+      <w:r>
+        <w:rPr>
+          <w:rFonts w:ascii="Times New Roman" w:hAnsi="Times New Roman" w:cs="Times New Roman"/>
           <w:sz w:val="24"/>
           <w:szCs w:val="24"/>
         </w:rPr>
@@ -812,7 +812,7 @@
       </w:r>
       <w:r>
         <w:rPr>
-          <w:rFonts w:ascii="Arial" w:hAnsi="Arial" w:cs="Arial"/>
+          <w:rFonts w:ascii="Times New Roman" w:hAnsi="Times New Roman" w:cs="Times New Roman"/>
           <w:sz w:val="24"/>
           <w:szCs w:val="24"/>
         </w:rPr>
@@ -820,7 +820,7 @@
       </w:r>
       <w:r>
         <w:rPr>
-          <w:rFonts w:ascii="Arial" w:hAnsi="Arial" w:cs="Arial"/>
+          <w:rFonts w:ascii="Times New Roman" w:hAnsi="Times New Roman" w:cs="Times New Roman"/>
           <w:sz w:val="24"/>
           <w:szCs w:val="24"/>
         </w:rPr>
@@ -828,7 +828,7 @@
       </w:r>
       <w:r>
         <w:rPr>
-          <w:rFonts w:ascii="Arial" w:hAnsi="Arial" w:cs="Arial"/>
+          <w:rFonts w:ascii="Times New Roman" w:hAnsi="Times New Roman" w:cs="Times New Roman"/>
           <w:sz w:val="24"/>
           <w:szCs w:val="24"/>
         </w:rPr>
@@ -836,7 +836,7 @@
       </w:r>
       <w:r>
         <w:rPr>
-          <w:rFonts w:ascii="Arial" w:hAnsi="Arial" w:cs="Arial"/>
+          <w:rFonts w:ascii="Times New Roman" w:hAnsi="Times New Roman" w:cs="Times New Roman"/>
           <w:sz w:val="24"/>
           <w:szCs w:val="24"/>
         </w:rPr>
@@ -847,15 +847,16 @@
       <w:pPr>
         <w:pStyle w:val="Listaconvietas"/>
         <w:spacing w:after="40"/>
-        <w:rPr>
-          <w:rFonts w:ascii="Arial" w:hAnsi="Arial" w:cs="Arial"/>
-          <w:sz w:val="24"/>
-          <w:szCs w:val="24"/>
-        </w:rPr>
-      </w:pPr>
-      <w:r>
-        <w:rPr>
-          <w:rFonts w:ascii="Arial" w:hAnsi="Arial" w:cs="Arial"/>
+        <w:jc w:val="both"/>
+        <w:rPr>
+          <w:rFonts w:ascii="Times New Roman" w:hAnsi="Times New Roman" w:cs="Times New Roman"/>
+          <w:sz w:val="24"/>
+          <w:szCs w:val="24"/>
+        </w:rPr>
+      </w:pPr>
+      <w:r>
+        <w:rPr>
+          <w:rFonts w:ascii="Times New Roman" w:hAnsi="Times New Roman" w:cs="Times New Roman"/>
           <w:sz w:val="24"/>
           <w:szCs w:val="24"/>
         </w:rPr>
@@ -863,7 +864,7 @@
       </w:r>
       <w:r>
         <w:rPr>
-          <w:rFonts w:ascii="Arial" w:hAnsi="Arial" w:cs="Arial"/>
+          <w:rFonts w:ascii="Times New Roman" w:hAnsi="Times New Roman" w:cs="Times New Roman"/>
           <w:sz w:val="24"/>
           <w:szCs w:val="24"/>
         </w:rPr>
@@ -871,7 +872,7 @@
       </w:r>
       <w:r>
         <w:rPr>
-          <w:rFonts w:ascii="Arial" w:hAnsi="Arial" w:cs="Arial"/>
+          <w:rFonts w:ascii="Times New Roman" w:hAnsi="Times New Roman" w:cs="Times New Roman"/>
           <w:sz w:val="24"/>
           <w:szCs w:val="24"/>
         </w:rPr>
@@ -882,15 +883,16 @@
       <w:pPr>
         <w:pStyle w:val="Listaconvietas"/>
         <w:spacing w:after="40"/>
-        <w:rPr>
-          <w:rFonts w:ascii="Arial" w:hAnsi="Arial" w:cs="Arial"/>
-          <w:sz w:val="24"/>
-          <w:szCs w:val="24"/>
-        </w:rPr>
-      </w:pPr>
-      <w:r>
-        <w:rPr>
-          <w:rFonts w:ascii="Arial" w:hAnsi="Arial" w:cs="Arial"/>
+        <w:jc w:val="both"/>
+        <w:rPr>
+          <w:rFonts w:ascii="Times New Roman" w:hAnsi="Times New Roman" w:cs="Times New Roman"/>
+          <w:sz w:val="24"/>
+          <w:szCs w:val="24"/>
+        </w:rPr>
+      </w:pPr>
+      <w:r>
+        <w:rPr>
+          <w:rFonts w:ascii="Times New Roman" w:hAnsi="Times New Roman" w:cs="Times New Roman"/>
           <w:sz w:val="24"/>
           <w:szCs w:val="24"/>
         </w:rPr>
@@ -899,7 +901,7 @@
       <w:proofErr w:type="spellStart"/>
       <w:r>
         <w:rPr>
-          <w:rFonts w:ascii="Arial" w:hAnsi="Arial" w:cs="Arial"/>
+          <w:rFonts w:ascii="Times New Roman" w:hAnsi="Times New Roman" w:cs="Times New Roman"/>
           <w:sz w:val="24"/>
           <w:szCs w:val="24"/>
         </w:rPr>
@@ -908,7 +910,7 @@
       <w:proofErr w:type="spellEnd"/>
       <w:r>
         <w:rPr>
-          <w:rFonts w:ascii="Arial" w:hAnsi="Arial" w:cs="Arial"/>
+          <w:rFonts w:ascii="Times New Roman" w:hAnsi="Times New Roman" w:cs="Times New Roman"/>
           <w:sz w:val="24"/>
           <w:szCs w:val="24"/>
         </w:rPr>
@@ -919,15 +921,16 @@
       <w:pPr>
         <w:pStyle w:val="Listaconvietas"/>
         <w:spacing w:after="40"/>
-        <w:rPr>
-          <w:rFonts w:ascii="Arial" w:hAnsi="Arial" w:cs="Arial"/>
-          <w:sz w:val="24"/>
-          <w:szCs w:val="24"/>
-        </w:rPr>
-      </w:pPr>
-      <w:r>
-        <w:rPr>
-          <w:rFonts w:ascii="Arial" w:hAnsi="Arial" w:cs="Arial"/>
+        <w:jc w:val="both"/>
+        <w:rPr>
+          <w:rFonts w:ascii="Times New Roman" w:hAnsi="Times New Roman" w:cs="Times New Roman"/>
+          <w:sz w:val="24"/>
+          <w:szCs w:val="24"/>
+        </w:rPr>
+      </w:pPr>
+      <w:r>
+        <w:rPr>
+          <w:rFonts w:ascii="Times New Roman" w:hAnsi="Times New Roman" w:cs="Times New Roman"/>
           <w:sz w:val="24"/>
           <w:szCs w:val="24"/>
         </w:rPr>
@@ -935,7 +938,7 @@
       </w:r>
       <w:r>
         <w:rPr>
-          <w:rFonts w:ascii="Arial" w:hAnsi="Arial" w:cs="Arial"/>
+          <w:rFonts w:ascii="Times New Roman" w:hAnsi="Times New Roman" w:cs="Times New Roman"/>
           <w:sz w:val="24"/>
           <w:szCs w:val="24"/>
         </w:rPr>
@@ -943,7 +946,7 @@
       </w:r>
       <w:r>
         <w:rPr>
-          <w:rFonts w:ascii="Arial" w:hAnsi="Arial" w:cs="Arial"/>
+          <w:rFonts w:ascii="Times New Roman" w:hAnsi="Times New Roman" w:cs="Times New Roman"/>
           <w:sz w:val="24"/>
           <w:szCs w:val="24"/>
         </w:rPr>
@@ -953,9 +956,10 @@
     <w:p>
       <w:pPr>
         <w:pStyle w:val="Ttulo2"/>
-        <w:spacing w:before="80" w:after="120"/>
-        <w:rPr>
-          <w:rFonts w:ascii="Arial" w:hAnsi="Arial" w:cs="Arial"/>
+        <w:spacing w:before="0" w:after="120"/>
+        <w:jc w:val="both"/>
+        <w:rPr>
+          <w:rFonts w:ascii="Times New Roman" w:hAnsi="Times New Roman" w:cs="Times New Roman"/>
           <w:color w:val="auto"/>
           <w:sz w:val="24"/>
           <w:szCs w:val="24"/>
@@ -963,7 +967,7 @@
       </w:pPr>
       <w:r>
         <w:rPr>
-          <w:rFonts w:ascii="Arial" w:hAnsi="Arial" w:cs="Arial"/>
+          <w:rFonts w:ascii="Times New Roman" w:hAnsi="Times New Roman" w:cs="Times New Roman"/>
           <w:color w:val="auto"/>
           <w:sz w:val="24"/>
           <w:szCs w:val="24"/>
@@ -974,16 +978,17 @@
     <w:p>
       <w:pPr>
         <w:spacing w:after="160"/>
-        <w:jc w:val="center"/>
-        <w:rPr>
-          <w:rFonts w:ascii="Arial" w:hAnsi="Arial" w:cs="Arial"/>
-          <w:sz w:val="24"/>
-          <w:szCs w:val="24"/>
-        </w:rPr>
-      </w:pPr>
-      <w:r>
-        <w:rPr>
-          <w:rFonts w:ascii="Arial" w:hAnsi="Arial" w:cs="Arial"/>
+        <w:jc w:val="both"/>
+        <w:rPr>
+          <w:rFonts w:ascii="Times New Roman" w:hAnsi="Times New Roman" w:cs="Times New Roman"/>
+          <w:sz w:val="24"/>
+          <w:szCs w:val="24"/>
+        </w:rPr>
+      </w:pPr>
+      <w:r>
+        <w:rPr>
+          <w:rFonts w:ascii="Times New Roman" w:hAnsi="Times New Roman" w:cs="Times New Roman"/>
+          <w:noProof/>
           <w:sz w:val="24"/>
           <w:szCs w:val="24"/>
         </w:rPr>
@@ -1027,9 +1032,10 @@
     <w:p>
       <w:pPr>
         <w:pStyle w:val="Ttulo2"/>
-        <w:spacing w:before="80" w:after="120"/>
-        <w:rPr>
-          <w:rFonts w:ascii="Arial" w:hAnsi="Arial" w:cs="Arial"/>
+        <w:spacing w:before="0" w:after="120"/>
+        <w:jc w:val="both"/>
+        <w:rPr>
+          <w:rFonts w:ascii="Times New Roman" w:hAnsi="Times New Roman" w:cs="Times New Roman"/>
           <w:color w:val="auto"/>
           <w:sz w:val="24"/>
           <w:szCs w:val="24"/>
@@ -1037,26 +1043,26 @@
       </w:pPr>
       <w:r>
         <w:rPr>
-          <w:rFonts w:ascii="Arial" w:hAnsi="Arial" w:cs="Arial"/>
+          <w:rFonts w:ascii="Times New Roman" w:hAnsi="Times New Roman" w:cs="Times New Roman"/>
           <w:color w:val="auto"/>
           <w:sz w:val="24"/>
           <w:szCs w:val="24"/>
         </w:rPr>
-        <w:lastRenderedPageBreak/>
         <w:t>Base de datos en archivos TXT</w:t>
       </w:r>
     </w:p>
     <w:p>
       <w:pPr>
-        <w:rPr>
-          <w:rFonts w:ascii="Arial" w:hAnsi="Arial" w:cs="Arial"/>
-          <w:sz w:val="24"/>
-          <w:szCs w:val="24"/>
-        </w:rPr>
-      </w:pPr>
-      <w:r>
-        <w:rPr>
-          <w:rFonts w:ascii="Arial" w:hAnsi="Arial" w:cs="Arial"/>
+        <w:jc w:val="both"/>
+        <w:rPr>
+          <w:rFonts w:ascii="Times New Roman" w:hAnsi="Times New Roman" w:cs="Times New Roman"/>
+          <w:sz w:val="24"/>
+          <w:szCs w:val="24"/>
+        </w:rPr>
+      </w:pPr>
+      <w:r>
+        <w:rPr>
+          <w:rFonts w:ascii="Times New Roman" w:hAnsi="Times New Roman" w:cs="Times New Roman"/>
           <w:sz w:val="24"/>
           <w:szCs w:val="24"/>
         </w:rPr>
@@ -1064,7 +1070,7 @@
       </w:r>
       <w:r>
         <w:rPr>
-          <w:rFonts w:ascii="Arial" w:hAnsi="Arial" w:cs="Arial"/>
+          <w:rFonts w:ascii="Times New Roman" w:hAnsi="Times New Roman" w:cs="Times New Roman"/>
           <w:sz w:val="24"/>
           <w:szCs w:val="24"/>
         </w:rPr>
@@ -1072,7 +1078,7 @@
       </w:r>
       <w:r>
         <w:rPr>
-          <w:rFonts w:ascii="Arial" w:hAnsi="Arial" w:cs="Arial"/>
+          <w:rFonts w:ascii="Times New Roman" w:hAnsi="Times New Roman" w:cs="Times New Roman"/>
           <w:sz w:val="24"/>
           <w:szCs w:val="24"/>
         </w:rPr>
@@ -1080,15 +1086,24 @@
       </w:r>
       <w:r>
         <w:rPr>
-          <w:rFonts w:ascii="Arial" w:hAnsi="Arial" w:cs="Arial"/>
-          <w:sz w:val="24"/>
-          <w:szCs w:val="24"/>
-        </w:rPr>
-        <w:t>valores separados</w:t>
-      </w:r>
-      <w:r>
-        <w:rPr>
-          <w:rFonts w:ascii="Arial" w:hAnsi="Arial" w:cs="Arial"/>
+          <w:rFonts w:ascii="Times New Roman" w:hAnsi="Times New Roman" w:cs="Times New Roman"/>
+          <w:sz w:val="24"/>
+          <w:szCs w:val="24"/>
+        </w:rPr>
+        <w:t xml:space="preserve">valores </w:t>
+      </w:r>
+      <w:r>
+        <w:rPr>
+          <w:rFonts w:ascii="Times New Roman" w:hAnsi="Times New Roman" w:cs="Times New Roman"/>
+          <w:sz w:val="24"/>
+          <w:szCs w:val="24"/>
+        </w:rPr>
+        <w:lastRenderedPageBreak/>
+        <w:t>separados</w:t>
+      </w:r>
+      <w:r>
+        <w:rPr>
+          <w:rFonts w:ascii="Times New Roman" w:hAnsi="Times New Roman" w:cs="Times New Roman"/>
           <w:sz w:val="24"/>
           <w:szCs w:val="24"/>
         </w:rPr>
@@ -1096,7 +1111,7 @@
       </w:r>
       <w:r>
         <w:rPr>
-          <w:rFonts w:ascii="Arial" w:hAnsi="Arial" w:cs="Arial"/>
+          <w:rFonts w:ascii="Times New Roman" w:hAnsi="Times New Roman" w:cs="Times New Roman"/>
           <w:sz w:val="24"/>
           <w:szCs w:val="24"/>
         </w:rPr>
@@ -1104,7 +1119,7 @@
       </w:r>
       <w:r>
         <w:rPr>
-          <w:rFonts w:ascii="Arial" w:hAnsi="Arial" w:cs="Arial"/>
+          <w:rFonts w:ascii="Times New Roman" w:hAnsi="Times New Roman" w:cs="Times New Roman"/>
           <w:sz w:val="24"/>
           <w:szCs w:val="24"/>
         </w:rPr>
@@ -1114,16 +1129,17 @@
     <w:p>
       <w:pPr>
         <w:spacing w:after="160"/>
-        <w:jc w:val="center"/>
-        <w:rPr>
-          <w:rFonts w:ascii="Arial" w:hAnsi="Arial" w:cs="Arial"/>
-          <w:sz w:val="24"/>
-          <w:szCs w:val="24"/>
-        </w:rPr>
-      </w:pPr>
-      <w:r>
-        <w:rPr>
-          <w:rFonts w:ascii="Arial" w:hAnsi="Arial" w:cs="Arial"/>
+        <w:jc w:val="both"/>
+        <w:rPr>
+          <w:rFonts w:ascii="Times New Roman" w:hAnsi="Times New Roman" w:cs="Times New Roman"/>
+          <w:sz w:val="24"/>
+          <w:szCs w:val="24"/>
+        </w:rPr>
+      </w:pPr>
+      <w:r>
+        <w:rPr>
+          <w:rFonts w:ascii="Times New Roman" w:hAnsi="Times New Roman" w:cs="Times New Roman"/>
+          <w:noProof/>
           <w:sz w:val="24"/>
           <w:szCs w:val="24"/>
         </w:rPr>
@@ -1167,9 +1183,10 @@
     <w:p>
       <w:pPr>
         <w:pStyle w:val="Ttulo2"/>
-        <w:spacing w:before="80" w:after="120"/>
-        <w:rPr>
-          <w:rFonts w:ascii="Arial" w:hAnsi="Arial" w:cs="Arial"/>
+        <w:spacing w:before="0" w:after="120"/>
+        <w:jc w:val="both"/>
+        <w:rPr>
+          <w:rFonts w:ascii="Times New Roman" w:hAnsi="Times New Roman" w:cs="Times New Roman"/>
           <w:color w:val="auto"/>
           <w:sz w:val="24"/>
           <w:szCs w:val="24"/>
@@ -1177,7 +1194,7 @@
       </w:pPr>
       <w:r>
         <w:rPr>
-          <w:rFonts w:ascii="Arial" w:hAnsi="Arial" w:cs="Arial"/>
+          <w:rFonts w:ascii="Times New Roman" w:hAnsi="Times New Roman" w:cs="Times New Roman"/>
           <w:color w:val="auto"/>
           <w:sz w:val="24"/>
           <w:szCs w:val="24"/>
@@ -1188,16 +1205,17 @@
     <w:p>
       <w:pPr>
         <w:spacing w:after="160"/>
-        <w:jc w:val="center"/>
-        <w:rPr>
-          <w:rFonts w:ascii="Arial" w:hAnsi="Arial" w:cs="Arial"/>
-          <w:sz w:val="24"/>
-          <w:szCs w:val="24"/>
-        </w:rPr>
-      </w:pPr>
-      <w:r>
-        <w:rPr>
-          <w:rFonts w:ascii="Arial" w:hAnsi="Arial" w:cs="Arial"/>
+        <w:jc w:val="both"/>
+        <w:rPr>
+          <w:rFonts w:ascii="Times New Roman" w:hAnsi="Times New Roman" w:cs="Times New Roman"/>
+          <w:sz w:val="24"/>
+          <w:szCs w:val="24"/>
+        </w:rPr>
+      </w:pPr>
+      <w:r>
+        <w:rPr>
+          <w:rFonts w:ascii="Times New Roman" w:hAnsi="Times New Roman" w:cs="Times New Roman"/>
+          <w:noProof/>
           <w:sz w:val="24"/>
           <w:szCs w:val="24"/>
         </w:rPr>
@@ -1241,9 +1259,10 @@
     <w:p>
       <w:pPr>
         <w:pStyle w:val="Ttulo2"/>
-        <w:spacing w:before="80" w:after="120"/>
-        <w:rPr>
-          <w:rFonts w:ascii="Arial" w:hAnsi="Arial" w:cs="Arial"/>
+        <w:spacing w:before="0" w:after="120"/>
+        <w:jc w:val="both"/>
+        <w:rPr>
+          <w:rFonts w:ascii="Times New Roman" w:hAnsi="Times New Roman" w:cs="Times New Roman"/>
           <w:color w:val="auto"/>
           <w:sz w:val="24"/>
           <w:szCs w:val="24"/>
@@ -1251,7 +1270,7 @@
       </w:pPr>
       <w:r>
         <w:rPr>
-          <w:rFonts w:ascii="Arial" w:hAnsi="Arial" w:cs="Arial"/>
+          <w:rFonts w:ascii="Times New Roman" w:hAnsi="Times New Roman" w:cs="Times New Roman"/>
           <w:color w:val="auto"/>
           <w:sz w:val="24"/>
           <w:szCs w:val="24"/>
@@ -1260,7 +1279,7 @@
       </w:r>
       <w:r>
         <w:rPr>
-          <w:rFonts w:ascii="Arial" w:hAnsi="Arial" w:cs="Arial"/>
+          <w:rFonts w:ascii="Times New Roman" w:hAnsi="Times New Roman" w:cs="Times New Roman"/>
           <w:color w:val="auto"/>
           <w:sz w:val="24"/>
           <w:szCs w:val="24"/>
@@ -1270,15 +1289,16 @@
     </w:p>
     <w:p>
       <w:pPr>
-        <w:rPr>
-          <w:rFonts w:ascii="Arial" w:hAnsi="Arial" w:cs="Arial"/>
-          <w:sz w:val="24"/>
-          <w:szCs w:val="24"/>
-        </w:rPr>
-      </w:pPr>
-      <w:r>
-        <w:rPr>
-          <w:rFonts w:ascii="Arial" w:hAnsi="Arial" w:cs="Arial"/>
+        <w:jc w:val="both"/>
+        <w:rPr>
+          <w:rFonts w:ascii="Times New Roman" w:hAnsi="Times New Roman" w:cs="Times New Roman"/>
+          <w:sz w:val="24"/>
+          <w:szCs w:val="24"/>
+        </w:rPr>
+      </w:pPr>
+      <w:r>
+        <w:rPr>
+          <w:rFonts w:ascii="Times New Roman" w:hAnsi="Times New Roman" w:cs="Times New Roman"/>
           <w:sz w:val="24"/>
           <w:szCs w:val="24"/>
         </w:rPr>
@@ -1287,7 +1307,7 @@
       <w:proofErr w:type="spellStart"/>
       <w:r>
         <w:rPr>
-          <w:rFonts w:ascii="Arial" w:hAnsi="Arial" w:cs="Arial"/>
+          <w:rFonts w:ascii="Times New Roman" w:hAnsi="Times New Roman" w:cs="Times New Roman"/>
           <w:sz w:val="24"/>
           <w:szCs w:val="24"/>
         </w:rPr>
@@ -1296,7 +1316,7 @@
       <w:proofErr w:type="spellEnd"/>
       <w:r>
         <w:rPr>
-          <w:rFonts w:ascii="Arial" w:hAnsi="Arial" w:cs="Arial"/>
+          <w:rFonts w:ascii="Times New Roman" w:hAnsi="Times New Roman" w:cs="Times New Roman"/>
           <w:sz w:val="24"/>
           <w:szCs w:val="24"/>
         </w:rPr>
@@ -1304,7 +1324,7 @@
       </w:r>
       <w:r>
         <w:rPr>
-          <w:rFonts w:ascii="Arial" w:hAnsi="Arial" w:cs="Arial"/>
+          <w:rFonts w:ascii="Times New Roman" w:hAnsi="Times New Roman" w:cs="Times New Roman"/>
           <w:sz w:val="24"/>
           <w:szCs w:val="24"/>
         </w:rPr>
@@ -1312,7 +1332,7 @@
       </w:r>
       <w:r>
         <w:rPr>
-          <w:rFonts w:ascii="Arial" w:hAnsi="Arial" w:cs="Arial"/>
+          <w:rFonts w:ascii="Times New Roman" w:hAnsi="Times New Roman" w:cs="Times New Roman"/>
           <w:sz w:val="24"/>
           <w:szCs w:val="24"/>
         </w:rPr>
@@ -1321,16 +1341,17 @@
     </w:p>
     <w:p>
       <w:pPr>
-        <w:jc w:val="center"/>
-        <w:rPr>
-          <w:rFonts w:ascii="Arial" w:hAnsi="Arial" w:cs="Arial"/>
-          <w:sz w:val="24"/>
-          <w:szCs w:val="24"/>
-        </w:rPr>
-      </w:pPr>
-      <w:r>
-        <w:rPr>
-          <w:rFonts w:ascii="Arial" w:hAnsi="Arial" w:cs="Arial"/>
+        <w:jc w:val="both"/>
+        <w:rPr>
+          <w:rFonts w:ascii="Times New Roman" w:hAnsi="Times New Roman" w:cs="Times New Roman"/>
+          <w:sz w:val="24"/>
+          <w:szCs w:val="24"/>
+        </w:rPr>
+      </w:pPr>
+      <w:r>
+        <w:rPr>
+          <w:rFonts w:ascii="Times New Roman" w:hAnsi="Times New Roman" w:cs="Times New Roman"/>
+          <w:noProof/>
           <w:sz w:val="24"/>
           <w:szCs w:val="24"/>
         </w:rPr>
@@ -1375,16 +1396,16 @@
     <w:p>
       <w:pPr>
         <w:spacing w:after="160"/>
-        <w:jc w:val="center"/>
-        <w:rPr>
-          <w:rFonts w:ascii="Arial" w:hAnsi="Arial" w:cs="Arial"/>
-          <w:sz w:val="24"/>
-          <w:szCs w:val="24"/>
-        </w:rPr>
-      </w:pPr>
-      <w:r>
-        <w:rPr>
-          <w:rFonts w:ascii="Arial" w:hAnsi="Arial" w:cs="Arial"/>
+        <w:jc w:val="both"/>
+        <w:rPr>
+          <w:rFonts w:ascii="Times New Roman" w:hAnsi="Times New Roman" w:cs="Times New Roman"/>
+          <w:sz w:val="24"/>
+          <w:szCs w:val="24"/>
+        </w:rPr>
+      </w:pPr>
+      <w:r>
+        <w:rPr>
+          <w:rFonts w:ascii="Times New Roman" w:hAnsi="Times New Roman" w:cs="Times New Roman"/>
           <w:i/>
           <w:sz w:val="24"/>
           <w:szCs w:val="24"/>
@@ -1393,7 +1414,7 @@
       </w:r>
       <w:r>
         <w:rPr>
-          <w:rFonts w:ascii="Arial" w:hAnsi="Arial" w:cs="Arial"/>
+          <w:rFonts w:ascii="Times New Roman" w:hAnsi="Times New Roman" w:cs="Times New Roman"/>
           <w:i/>
           <w:sz w:val="24"/>
           <w:szCs w:val="24"/>
@@ -1402,7 +1423,7 @@
       </w:r>
       <w:r>
         <w:rPr>
-          <w:rFonts w:ascii="Arial" w:hAnsi="Arial" w:cs="Arial"/>
+          <w:rFonts w:ascii="Times New Roman" w:hAnsi="Times New Roman" w:cs="Times New Roman"/>
           <w:i/>
           <w:sz w:val="24"/>
           <w:szCs w:val="24"/>
@@ -1412,14 +1433,19 @@
     </w:p>
     <w:p>
       <w:pPr>
-        <w:rPr>
-          <w:rFonts w:ascii="Arial" w:hAnsi="Arial" w:cs="Arial"/>
+        <w:jc w:val="both"/>
+        <w:rPr>
+          <w:rFonts w:ascii="Times New Roman" w:hAnsi="Times New Roman" w:cs="Times New Roman"/>
           <w:sz w:val="24"/>
           <w:szCs w:val="24"/>
         </w:rPr>
         <w:sectPr>
-          <w:headerReference w:type="default" r:id="rId12"/>
-          <w:footerReference w:type="default" r:id="rId13"/>
+          <w:headerReference w:type="even" r:id="rId12"/>
+          <w:headerReference w:type="default" r:id="rId13"/>
+          <w:footerReference w:type="even" r:id="rId14"/>
+          <w:footerReference w:type="default" r:id="rId15"/>
+          <w:headerReference w:type="first" r:id="rId16"/>
+          <w:footerReference w:type="first" r:id="rId17"/>
           <w:pgSz w:w="12240" w:h="15840"/>
           <w:pgMar w:top="1417" w:right="1701" w:bottom="1417" w:left="1701" w:header="720" w:footer="720" w:gutter="0"/>
           <w:pgBorders w:offsetFrom="page">
@@ -1436,9 +1462,10 @@
     <w:p>
       <w:pPr>
         <w:pStyle w:val="Ttulo2"/>
-        <w:spacing w:before="80" w:after="120"/>
-        <w:rPr>
-          <w:rFonts w:ascii="Arial" w:hAnsi="Arial" w:cs="Arial"/>
+        <w:spacing w:before="0" w:after="120"/>
+        <w:jc w:val="both"/>
+        <w:rPr>
+          <w:rFonts w:ascii="Times New Roman" w:hAnsi="Times New Roman" w:cs="Times New Roman"/>
           <w:color w:val="auto"/>
           <w:sz w:val="24"/>
           <w:szCs w:val="24"/>
@@ -1446,7 +1473,7 @@
       </w:pPr>
       <w:r>
         <w:rPr>
-          <w:rFonts w:ascii="Arial" w:hAnsi="Arial" w:cs="Arial"/>
+          <w:rFonts w:ascii="Times New Roman" w:hAnsi="Times New Roman" w:cs="Times New Roman"/>
           <w:color w:val="auto"/>
           <w:sz w:val="24"/>
           <w:szCs w:val="24"/>
@@ -1458,16 +1485,17 @@
     <w:p>
       <w:pPr>
         <w:spacing w:after="160"/>
-        <w:jc w:val="center"/>
-        <w:rPr>
-          <w:rFonts w:ascii="Arial" w:hAnsi="Arial" w:cs="Arial"/>
-          <w:sz w:val="24"/>
-          <w:szCs w:val="24"/>
-        </w:rPr>
-      </w:pPr>
-      <w:r>
-        <w:rPr>
-          <w:rFonts w:ascii="Arial" w:hAnsi="Arial" w:cs="Arial"/>
+        <w:jc w:val="both"/>
+        <w:rPr>
+          <w:rFonts w:ascii="Times New Roman" w:hAnsi="Times New Roman" w:cs="Times New Roman"/>
+          <w:sz w:val="24"/>
+          <w:szCs w:val="24"/>
+        </w:rPr>
+      </w:pPr>
+      <w:r>
+        <w:rPr>
+          <w:rFonts w:ascii="Times New Roman" w:hAnsi="Times New Roman" w:cs="Times New Roman"/>
+          <w:noProof/>
           <w:sz w:val="24"/>
           <w:szCs w:val="24"/>
         </w:rPr>
@@ -1487,7 +1515,7 @@
                     <pic:cNvPicPr/>
                   </pic:nvPicPr>
                   <pic:blipFill>
-                    <a:blip r:embed="rId14"/>
+                    <a:blip r:embed="rId18"/>
                     <a:stretch>
                       <a:fillRect/>
                     </a:stretch>
@@ -1511,9 +1539,10 @@
     <w:p>
       <w:pPr>
         <w:pStyle w:val="Ttulo2"/>
-        <w:spacing w:before="80" w:after="120"/>
-        <w:rPr>
-          <w:rFonts w:ascii="Arial" w:hAnsi="Arial" w:cs="Arial"/>
+        <w:spacing w:before="0" w:after="120"/>
+        <w:jc w:val="both"/>
+        <w:rPr>
+          <w:rFonts w:ascii="Times New Roman" w:hAnsi="Times New Roman" w:cs="Times New Roman"/>
           <w:color w:val="auto"/>
           <w:sz w:val="24"/>
           <w:szCs w:val="24"/>
@@ -1521,7 +1550,7 @@
       </w:pPr>
       <w:r>
         <w:rPr>
-          <w:rFonts w:ascii="Arial" w:hAnsi="Arial" w:cs="Arial"/>
+          <w:rFonts w:ascii="Times New Roman" w:hAnsi="Times New Roman" w:cs="Times New Roman"/>
           <w:color w:val="auto"/>
           <w:sz w:val="24"/>
           <w:szCs w:val="24"/>
@@ -1531,15 +1560,16 @@
     </w:p>
     <w:p>
       <w:pPr>
-        <w:rPr>
-          <w:rFonts w:ascii="Arial" w:hAnsi="Arial" w:cs="Arial"/>
-          <w:sz w:val="24"/>
-          <w:szCs w:val="24"/>
-        </w:rPr>
-      </w:pPr>
-      <w:r>
-        <w:rPr>
-          <w:rFonts w:ascii="Arial" w:hAnsi="Arial" w:cs="Arial"/>
+        <w:jc w:val="both"/>
+        <w:rPr>
+          <w:rFonts w:ascii="Times New Roman" w:hAnsi="Times New Roman" w:cs="Times New Roman"/>
+          <w:sz w:val="24"/>
+          <w:szCs w:val="24"/>
+        </w:rPr>
+      </w:pPr>
+      <w:r>
+        <w:rPr>
+          <w:rFonts w:ascii="Times New Roman" w:hAnsi="Times New Roman" w:cs="Times New Roman"/>
           <w:sz w:val="24"/>
           <w:szCs w:val="24"/>
         </w:rPr>
@@ -1547,7 +1577,7 @@
       </w:r>
       <w:r>
         <w:rPr>
-          <w:rFonts w:ascii="Arial" w:hAnsi="Arial" w:cs="Arial"/>
+          <w:rFonts w:ascii="Times New Roman" w:hAnsi="Times New Roman" w:cs="Times New Roman"/>
           <w:sz w:val="24"/>
           <w:szCs w:val="24"/>
         </w:rPr>
@@ -1555,7 +1585,7 @@
       </w:r>
       <w:r>
         <w:rPr>
-          <w:rFonts w:ascii="Arial" w:hAnsi="Arial" w:cs="Arial"/>
+          <w:rFonts w:ascii="Times New Roman" w:hAnsi="Times New Roman" w:cs="Times New Roman"/>
           <w:sz w:val="24"/>
           <w:szCs w:val="24"/>
         </w:rPr>
@@ -1563,7 +1593,7 @@
       </w:r>
       <w:r>
         <w:rPr>
-          <w:rFonts w:ascii="Arial" w:hAnsi="Arial" w:cs="Arial"/>
+          <w:rFonts w:ascii="Times New Roman" w:hAnsi="Times New Roman" w:cs="Times New Roman"/>
           <w:sz w:val="24"/>
           <w:szCs w:val="24"/>
         </w:rPr>
@@ -1571,7 +1601,7 @@
       </w:r>
       <w:r>
         <w:rPr>
-          <w:rFonts w:ascii="Arial" w:hAnsi="Arial" w:cs="Arial"/>
+          <w:rFonts w:ascii="Times New Roman" w:hAnsi="Times New Roman" w:cs="Times New Roman"/>
           <w:sz w:val="24"/>
           <w:szCs w:val="24"/>
         </w:rPr>
@@ -1581,16 +1611,17 @@
     <w:p>
       <w:pPr>
         <w:spacing w:after="160"/>
-        <w:jc w:val="center"/>
-        <w:rPr>
-          <w:rFonts w:ascii="Arial" w:hAnsi="Arial" w:cs="Arial"/>
-          <w:sz w:val="24"/>
-          <w:szCs w:val="24"/>
-        </w:rPr>
-      </w:pPr>
-      <w:r>
-        <w:rPr>
-          <w:rFonts w:ascii="Arial" w:hAnsi="Arial" w:cs="Arial"/>
+        <w:jc w:val="both"/>
+        <w:rPr>
+          <w:rFonts w:ascii="Times New Roman" w:hAnsi="Times New Roman" w:cs="Times New Roman"/>
+          <w:sz w:val="24"/>
+          <w:szCs w:val="24"/>
+        </w:rPr>
+      </w:pPr>
+      <w:r>
+        <w:rPr>
+          <w:rFonts w:ascii="Times New Roman" w:hAnsi="Times New Roman" w:cs="Times New Roman"/>
+          <w:noProof/>
           <w:sz w:val="24"/>
           <w:szCs w:val="24"/>
         </w:rPr>
@@ -1610,7 +1641,7 @@
                     <pic:cNvPicPr/>
                   </pic:nvPicPr>
                   <pic:blipFill>
-                    <a:blip r:embed="rId15"/>
+                    <a:blip r:embed="rId19"/>
                     <a:stretch>
                       <a:fillRect/>
                     </a:stretch>
@@ -1634,9 +1665,10 @@
     <w:p>
       <w:pPr>
         <w:pStyle w:val="Ttulo2"/>
-        <w:spacing w:before="80" w:after="120"/>
-        <w:rPr>
-          <w:rFonts w:ascii="Arial" w:hAnsi="Arial" w:cs="Arial"/>
+        <w:spacing w:before="0" w:after="120"/>
+        <w:jc w:val="both"/>
+        <w:rPr>
+          <w:rFonts w:ascii="Times New Roman" w:hAnsi="Times New Roman" w:cs="Times New Roman"/>
           <w:color w:val="auto"/>
           <w:sz w:val="24"/>
           <w:szCs w:val="24"/>
@@ -1644,18 +1676,150 @@
       </w:pPr>
       <w:r>
         <w:rPr>
-          <w:rFonts w:ascii="Arial" w:hAnsi="Arial" w:cs="Arial"/>
+          <w:rFonts w:ascii="Times New Roman" w:hAnsi="Times New Roman" w:cs="Times New Roman"/>
           <w:color w:val="auto"/>
           <w:sz w:val="24"/>
           <w:szCs w:val="24"/>
         </w:rPr>
-        <w:t>Validaciones y reglas de negocio</w:t>
+        <w:t>Flujo de uso</w:t>
       </w:r>
     </w:p>
     <w:p>
       <w:pPr>
+        <w:pStyle w:val="Listaconnmeros"/>
+        <w:spacing w:after="40"/>
+        <w:jc w:val="both"/>
+        <w:rPr>
+          <w:rFonts w:ascii="Times New Roman" w:hAnsi="Times New Roman" w:cs="Times New Roman"/>
+          <w:sz w:val="24"/>
+          <w:szCs w:val="24"/>
+        </w:rPr>
+      </w:pPr>
+      <w:r>
+        <w:rPr>
+          <w:rFonts w:ascii="Times New Roman" w:hAnsi="Times New Roman" w:cs="Times New Roman"/>
+          <w:sz w:val="24"/>
+          <w:szCs w:val="24"/>
+        </w:rPr>
+        <w:t>Ejecutar gui_app.py para abrir la interfaz gráfica.</w:t>
+      </w:r>
+    </w:p>
+    <w:p>
+      <w:pPr>
+        <w:pStyle w:val="Listaconnmeros"/>
+        <w:spacing w:after="40"/>
+        <w:jc w:val="both"/>
+        <w:rPr>
+          <w:rFonts w:ascii="Times New Roman" w:hAnsi="Times New Roman" w:cs="Times New Roman"/>
+          <w:sz w:val="24"/>
+          <w:szCs w:val="24"/>
+        </w:rPr>
+      </w:pPr>
+      <w:r>
+        <w:rPr>
+          <w:rFonts w:ascii="Times New Roman" w:hAnsi="Times New Roman" w:cs="Times New Roman"/>
+          <w:sz w:val="24"/>
+          <w:szCs w:val="24"/>
+        </w:rPr>
+        <w:t>Ingresar usuario y contraseña registrados en empleados.txt.</w:t>
+      </w:r>
+    </w:p>
+    <w:p>
+      <w:pPr>
+        <w:pStyle w:val="Listaconnmeros"/>
+        <w:spacing w:after="40"/>
+        <w:jc w:val="both"/>
+        <w:rPr>
+          <w:rFonts w:ascii="Times New Roman" w:hAnsi="Times New Roman" w:cs="Times New Roman"/>
+          <w:sz w:val="24"/>
+          <w:szCs w:val="24"/>
+        </w:rPr>
+      </w:pPr>
+      <w:r>
+        <w:rPr>
+          <w:rFonts w:ascii="Times New Roman" w:hAnsi="Times New Roman" w:cs="Times New Roman"/>
+          <w:sz w:val="24"/>
+          <w:szCs w:val="24"/>
+        </w:rPr>
+        <w:t>Seleccionar la tabla que se desea consultar o administrar.</w:t>
+      </w:r>
+    </w:p>
+    <w:p>
+      <w:pPr>
+        <w:pStyle w:val="Listaconnmeros"/>
+        <w:spacing w:after="40"/>
+        <w:jc w:val="both"/>
+        <w:rPr>
+          <w:rFonts w:ascii="Times New Roman" w:hAnsi="Times New Roman" w:cs="Times New Roman"/>
+          <w:sz w:val="24"/>
+          <w:szCs w:val="24"/>
+        </w:rPr>
+      </w:pPr>
+      <w:r>
+        <w:rPr>
+          <w:rFonts w:ascii="Times New Roman" w:hAnsi="Times New Roman" w:cs="Times New Roman"/>
+          <w:sz w:val="24"/>
+          <w:szCs w:val="24"/>
+        </w:rPr>
+        <w:t>Usar los botones de nuevo, editar, eliminar o refrescar según la operación requerida.</w:t>
+      </w:r>
+    </w:p>
+    <w:p>
+      <w:pPr>
+        <w:pStyle w:val="Listaconnmeros"/>
+        <w:spacing w:after="40"/>
+        <w:jc w:val="both"/>
+        <w:rPr>
+          <w:rFonts w:ascii="Times New Roman" w:hAnsi="Times New Roman" w:cs="Times New Roman"/>
+          <w:sz w:val="24"/>
+          <w:szCs w:val="24"/>
+        </w:rPr>
+      </w:pPr>
+      <w:r>
+        <w:rPr>
+          <w:rFonts w:ascii="Times New Roman" w:hAnsi="Times New Roman" w:cs="Times New Roman"/>
+          <w:sz w:val="24"/>
+          <w:szCs w:val="24"/>
+        </w:rPr>
+        <w:t>Guardar los cambios para actualizar el archivo TXT correspondiente.</w:t>
+      </w:r>
+    </w:p>
+    <w:p>
+      <w:pPr>
+        <w:pStyle w:val="Ttulo2"/>
+        <w:spacing w:before="0" w:after="120"/>
+        <w:jc w:val="both"/>
+        <w:rPr>
+          <w:rFonts w:ascii="Arial" w:hAnsi="Arial" w:cs="Arial"/>
+          <w:color w:val="auto"/>
+          <w:sz w:val="24"/>
+          <w:szCs w:val="24"/>
+        </w:rPr>
+      </w:pPr>
+      <w:r>
+        <w:rPr>
+          <w:rFonts w:ascii="Times New Roman" w:hAnsi="Times New Roman" w:cs="Times New Roman"/>
+          <w:color w:val="auto"/>
+          <w:sz w:val="24"/>
+          <w:szCs w:val="24"/>
+        </w:rPr>
+        <w:br/>
+      </w:r>
+      <w:r>
+        <w:rPr>
+          <w:rFonts w:ascii="Arial" w:hAnsi="Arial" w:cs="Arial"/>
+          <w:color w:val="auto"/>
+          <w:sz w:val="24"/>
+          <w:szCs w:val="24"/>
+        </w:rPr>
+        <w:t>Validaciones y reglas de negocio</w:t>
+      </w:r>
+    </w:p>
+    <w:p>
+      <w:pPr>
         <w:pStyle w:val="Listaconvietas"/>
         <w:spacing w:after="40"/>
+        <w:jc w:val="both"/>
         <w:rPr>
           <w:rFonts w:ascii="Arial" w:hAnsi="Arial" w:cs="Arial"/>
           <w:sz w:val="24"/>
@@ -1691,6 +1855,7 @@
       <w:pPr>
         <w:pStyle w:val="Listaconvietas"/>
         <w:spacing w:after="40"/>
+        <w:jc w:val="both"/>
         <w:rPr>
           <w:rFonts w:ascii="Arial" w:hAnsi="Arial" w:cs="Arial"/>
           <w:sz w:val="24"/>
@@ -1710,6 +1875,7 @@
       <w:pPr>
         <w:pStyle w:val="Listaconvietas"/>
         <w:spacing w:after="40"/>
+        <w:jc w:val="both"/>
         <w:rPr>
           <w:rFonts w:ascii="Arial" w:hAnsi="Arial" w:cs="Arial"/>
           <w:sz w:val="24"/>
@@ -1745,6 +1911,7 @@
       <w:pPr>
         <w:pStyle w:val="Listaconvietas"/>
         <w:spacing w:after="40"/>
+        <w:jc w:val="both"/>
         <w:rPr>
           <w:rFonts w:ascii="Arial" w:hAnsi="Arial" w:cs="Arial"/>
           <w:sz w:val="24"/>
@@ -1764,6 +1931,7 @@
       <w:pPr>
         <w:pStyle w:val="Listaconvietas"/>
         <w:spacing w:after="40"/>
+        <w:jc w:val="both"/>
         <w:rPr>
           <w:rFonts w:ascii="Arial" w:hAnsi="Arial" w:cs="Arial"/>
           <w:sz w:val="24"/>
@@ -1815,6 +1983,7 @@
       <w:pPr>
         <w:pStyle w:val="Listaconvietas"/>
         <w:spacing w:after="40"/>
+        <w:jc w:val="both"/>
         <w:rPr>
           <w:rFonts w:ascii="Arial" w:hAnsi="Arial" w:cs="Arial"/>
           <w:sz w:val="24"/>
@@ -1850,6 +2019,7 @@
       <w:pPr>
         <w:pStyle w:val="Listaconvietas"/>
         <w:spacing w:after="40"/>
+        <w:jc w:val="both"/>
         <w:rPr>
           <w:rFonts w:ascii="Arial" w:hAnsi="Arial" w:cs="Arial"/>
           <w:sz w:val="24"/>
@@ -1868,7 +2038,7 @@
     <w:p>
       <w:pPr>
         <w:pStyle w:val="Ttulo2"/>
-        <w:spacing w:before="80" w:after="120"/>
+        <w:jc w:val="both"/>
         <w:rPr>
           <w:rFonts w:ascii="Arial" w:hAnsi="Arial" w:cs="Arial"/>
           <w:color w:val="auto"/>
@@ -1883,209 +2053,1635 @@
           <w:sz w:val="24"/>
           <w:szCs w:val="24"/>
         </w:rPr>
-        <w:t>Flujo de uso</w:t>
+        <w:lastRenderedPageBreak/>
+        <w:t>1. Gestión de Autobuses (Terminales)</w:t>
       </w:r>
     </w:p>
     <w:p>
       <w:pPr>
+        <w:pStyle w:val="Listaconvietas"/>
+        <w:jc w:val="both"/>
+        <w:rPr>
+          <w:rFonts w:ascii="Arial" w:hAnsi="Arial" w:cs="Arial"/>
+          <w:sz w:val="24"/>
+          <w:szCs w:val="24"/>
+        </w:rPr>
+      </w:pPr>
+      <w:r>
+        <w:rPr>
+          <w:rFonts w:ascii="Arial" w:hAnsi="Arial" w:cs="Arial"/>
+          <w:sz w:val="24"/>
+          <w:szCs w:val="24"/>
+        </w:rPr>
+        <w:t>Cada autobús tiene número de unidad, modelo, capacidad total y placa.</w:t>
+      </w:r>
+    </w:p>
+    <w:p>
+      <w:pPr>
+        <w:pStyle w:val="Listaconvietas"/>
+        <w:jc w:val="both"/>
+        <w:rPr>
+          <w:rFonts w:ascii="Arial" w:hAnsi="Arial" w:cs="Arial"/>
+          <w:sz w:val="24"/>
+          <w:szCs w:val="24"/>
+        </w:rPr>
+      </w:pPr>
+      <w:r>
+        <w:rPr>
+          <w:rFonts w:ascii="Arial" w:hAnsi="Arial" w:cs="Arial"/>
+          <w:sz w:val="24"/>
+          <w:szCs w:val="24"/>
+        </w:rPr>
+        <w:t>La capacidad total es inmutable después de crear el viaje (determina asientos disponibles).</w:t>
+      </w:r>
+    </w:p>
+    <w:p>
+      <w:pPr>
+        <w:pStyle w:val="Listaconvietas"/>
+        <w:jc w:val="both"/>
+        <w:rPr>
+          <w:rFonts w:ascii="Arial" w:hAnsi="Arial" w:cs="Arial"/>
+          <w:sz w:val="24"/>
+          <w:szCs w:val="24"/>
+        </w:rPr>
+      </w:pPr>
+      <w:r>
+        <w:rPr>
+          <w:rFonts w:ascii="Arial" w:hAnsi="Arial" w:cs="Arial"/>
+          <w:sz w:val="24"/>
+          <w:szCs w:val="24"/>
+        </w:rPr>
+        <w:t>La placa debe ser única y válida.</w:t>
+      </w:r>
+    </w:p>
+    <w:p>
+      <w:pPr>
+        <w:pStyle w:val="Ttulo2"/>
+        <w:jc w:val="both"/>
+        <w:rPr>
+          <w:rFonts w:ascii="Arial" w:hAnsi="Arial" w:cs="Arial"/>
+          <w:color w:val="auto"/>
+          <w:sz w:val="24"/>
+          <w:szCs w:val="24"/>
+        </w:rPr>
+      </w:pPr>
+      <w:r>
+        <w:rPr>
+          <w:rFonts w:ascii="Arial" w:hAnsi="Arial" w:cs="Arial"/>
+          <w:color w:val="auto"/>
+          <w:sz w:val="24"/>
+          <w:szCs w:val="24"/>
+        </w:rPr>
+        <w:t>2. Gestión de Rutas</w:t>
+      </w:r>
+    </w:p>
+    <w:p>
+      <w:pPr>
+        <w:pStyle w:val="Listaconvietas"/>
+        <w:jc w:val="both"/>
+        <w:rPr>
+          <w:rFonts w:ascii="Arial" w:hAnsi="Arial" w:cs="Arial"/>
+          <w:sz w:val="24"/>
+          <w:szCs w:val="24"/>
+        </w:rPr>
+      </w:pPr>
+      <w:r>
+        <w:rPr>
+          <w:rFonts w:ascii="Arial" w:hAnsi="Arial" w:cs="Arial"/>
+          <w:sz w:val="24"/>
+          <w:szCs w:val="24"/>
+        </w:rPr>
+        <w:t>Una ruta conecta un origen con un destino.</w:t>
+      </w:r>
+    </w:p>
+    <w:p>
+      <w:pPr>
+        <w:pStyle w:val="Listaconvietas"/>
+        <w:jc w:val="both"/>
+        <w:rPr>
+          <w:rFonts w:ascii="Arial" w:hAnsi="Arial" w:cs="Arial"/>
+          <w:sz w:val="24"/>
+          <w:szCs w:val="24"/>
+        </w:rPr>
+      </w:pPr>
+      <w:r>
+        <w:rPr>
+          <w:rFonts w:ascii="Arial" w:hAnsi="Arial" w:cs="Arial"/>
+          <w:sz w:val="24"/>
+          <w:szCs w:val="24"/>
+        </w:rPr>
+        <w:t>Debe incluir distancia estimada (valor numérico).</w:t>
+      </w:r>
+    </w:p>
+    <w:p>
+      <w:pPr>
+        <w:pStyle w:val="Listaconvietas"/>
+        <w:jc w:val="both"/>
+        <w:rPr>
+          <w:rFonts w:ascii="Arial" w:hAnsi="Arial" w:cs="Arial"/>
+          <w:sz w:val="24"/>
+          <w:szCs w:val="24"/>
+        </w:rPr>
+      </w:pPr>
+      <w:r>
+        <w:rPr>
+          <w:rFonts w:ascii="Arial" w:hAnsi="Arial" w:cs="Arial"/>
+          <w:sz w:val="24"/>
+          <w:szCs w:val="24"/>
+        </w:rPr>
+        <w:t>Se pueden crear múltiples rutas entre los mismos puntos.</w:t>
+      </w:r>
+    </w:p>
+    <w:p>
+      <w:pPr>
+        <w:pStyle w:val="Listaconvietas"/>
+        <w:jc w:val="both"/>
+        <w:rPr>
+          <w:rFonts w:ascii="Arial" w:hAnsi="Arial" w:cs="Arial"/>
+          <w:sz w:val="24"/>
+          <w:szCs w:val="24"/>
+        </w:rPr>
+      </w:pPr>
+      <w:r>
+        <w:rPr>
+          <w:rFonts w:ascii="Arial" w:hAnsi="Arial" w:cs="Arial"/>
+          <w:sz w:val="24"/>
+          <w:szCs w:val="24"/>
+        </w:rPr>
+        <w:t>Las rutas son permanentes y reutilizables.</w:t>
+      </w:r>
+    </w:p>
+    <w:p>
+      <w:pPr>
+        <w:pStyle w:val="Ttulo2"/>
+        <w:jc w:val="both"/>
+        <w:rPr>
+          <w:rFonts w:ascii="Arial" w:hAnsi="Arial" w:cs="Arial"/>
+          <w:color w:val="auto"/>
+          <w:sz w:val="24"/>
+          <w:szCs w:val="24"/>
+        </w:rPr>
+      </w:pPr>
+      <w:r>
+        <w:rPr>
+          <w:rFonts w:ascii="Arial" w:hAnsi="Arial" w:cs="Arial"/>
+          <w:color w:val="auto"/>
+          <w:sz w:val="24"/>
+          <w:szCs w:val="24"/>
+        </w:rPr>
+        <w:t>3. Gestión de Viajes</w:t>
+      </w:r>
+    </w:p>
+    <w:p>
+      <w:pPr>
+        <w:pStyle w:val="Listaconvietas"/>
+        <w:jc w:val="both"/>
+        <w:rPr>
+          <w:rFonts w:ascii="Arial" w:hAnsi="Arial" w:cs="Arial"/>
+          <w:sz w:val="24"/>
+          <w:szCs w:val="24"/>
+        </w:rPr>
+      </w:pPr>
+      <w:r>
+        <w:rPr>
+          <w:rFonts w:ascii="Arial" w:hAnsi="Arial" w:cs="Arial"/>
+          <w:sz w:val="24"/>
+          <w:szCs w:val="24"/>
+        </w:rPr>
+        <w:t>Cada viaje DEBE relacionarse con una ruta válida (</w:t>
+      </w:r>
+      <w:proofErr w:type="spellStart"/>
+      <w:r>
+        <w:rPr>
+          <w:rFonts w:ascii="Arial" w:hAnsi="Arial" w:cs="Arial"/>
+          <w:sz w:val="24"/>
+          <w:szCs w:val="24"/>
+        </w:rPr>
+        <w:t>id_ruta</w:t>
+      </w:r>
+      <w:proofErr w:type="spellEnd"/>
+      <w:r>
+        <w:rPr>
+          <w:rFonts w:ascii="Arial" w:hAnsi="Arial" w:cs="Arial"/>
+          <w:sz w:val="24"/>
+          <w:szCs w:val="24"/>
+        </w:rPr>
+        <w:t xml:space="preserve"> debe existir en tabla rutas).</w:t>
+      </w:r>
+    </w:p>
+    <w:p>
+      <w:pPr>
+        <w:pStyle w:val="Listaconvietas"/>
+        <w:jc w:val="both"/>
+        <w:rPr>
+          <w:rFonts w:ascii="Arial" w:hAnsi="Arial" w:cs="Arial"/>
+          <w:sz w:val="24"/>
+          <w:szCs w:val="24"/>
+        </w:rPr>
+      </w:pPr>
+      <w:r>
+        <w:rPr>
+          <w:rFonts w:ascii="Arial" w:hAnsi="Arial" w:cs="Arial"/>
+          <w:sz w:val="24"/>
+          <w:szCs w:val="24"/>
+        </w:rPr>
+        <w:t>Cada viaje DEBE relacionarse con un autobús válido (</w:t>
+      </w:r>
+      <w:proofErr w:type="spellStart"/>
+      <w:r>
+        <w:rPr>
+          <w:rFonts w:ascii="Arial" w:hAnsi="Arial" w:cs="Arial"/>
+          <w:sz w:val="24"/>
+          <w:szCs w:val="24"/>
+        </w:rPr>
+        <w:t>id_autobus</w:t>
+      </w:r>
+      <w:proofErr w:type="spellEnd"/>
+      <w:r>
+        <w:rPr>
+          <w:rFonts w:ascii="Arial" w:hAnsi="Arial" w:cs="Arial"/>
+          <w:sz w:val="24"/>
+          <w:szCs w:val="24"/>
+        </w:rPr>
+        <w:t xml:space="preserve"> debe existir en tabla autobuses).</w:t>
+      </w:r>
+    </w:p>
+    <w:p>
+      <w:pPr>
+        <w:pStyle w:val="Listaconvietas"/>
+        <w:jc w:val="both"/>
+        <w:rPr>
+          <w:rFonts w:ascii="Arial" w:hAnsi="Arial" w:cs="Arial"/>
+          <w:sz w:val="24"/>
+          <w:szCs w:val="24"/>
+        </w:rPr>
+      </w:pPr>
+      <w:r>
+        <w:rPr>
+          <w:rFonts w:ascii="Arial" w:hAnsi="Arial" w:cs="Arial"/>
+          <w:sz w:val="24"/>
+          <w:szCs w:val="24"/>
+        </w:rPr>
+        <w:t>Incluye fecha y hora de salida en formato YYYY-MM-DD.</w:t>
+      </w:r>
+    </w:p>
+    <w:p>
+      <w:pPr>
+        <w:pStyle w:val="Listaconvietas"/>
+        <w:jc w:val="both"/>
+        <w:rPr>
+          <w:rFonts w:ascii="Arial" w:hAnsi="Arial" w:cs="Arial"/>
+          <w:sz w:val="24"/>
+          <w:szCs w:val="24"/>
+        </w:rPr>
+      </w:pPr>
+      <w:r>
+        <w:rPr>
+          <w:rFonts w:ascii="Arial" w:hAnsi="Arial" w:cs="Arial"/>
+          <w:sz w:val="24"/>
+          <w:szCs w:val="24"/>
+        </w:rPr>
+        <w:t>Tiene costo base (valor decimal).</w:t>
+      </w:r>
+    </w:p>
+    <w:p>
+      <w:pPr>
+        <w:pStyle w:val="Listaconvietas"/>
+        <w:jc w:val="both"/>
+        <w:rPr>
+          <w:rFonts w:ascii="Arial" w:hAnsi="Arial" w:cs="Arial"/>
+          <w:sz w:val="24"/>
+          <w:szCs w:val="24"/>
+        </w:rPr>
+      </w:pPr>
+      <w:r>
+        <w:rPr>
+          <w:rFonts w:ascii="Arial" w:hAnsi="Arial" w:cs="Arial"/>
+          <w:sz w:val="24"/>
+          <w:szCs w:val="24"/>
+        </w:rPr>
+        <w:t>Incluye información del cliente: nombre, teléfono y correo.</w:t>
+      </w:r>
+    </w:p>
+    <w:p>
+      <w:pPr>
+        <w:pStyle w:val="Listaconvietas"/>
+        <w:jc w:val="both"/>
+        <w:rPr>
+          <w:rFonts w:ascii="Arial" w:hAnsi="Arial" w:cs="Arial"/>
+          <w:sz w:val="24"/>
+          <w:szCs w:val="24"/>
+        </w:rPr>
+      </w:pPr>
+      <w:r>
+        <w:rPr>
+          <w:rFonts w:ascii="Arial" w:hAnsi="Arial" w:cs="Arial"/>
+          <w:sz w:val="24"/>
+          <w:szCs w:val="24"/>
+        </w:rPr>
+        <w:t xml:space="preserve">Cálculo de asientos disponibles: </w:t>
+      </w:r>
+      <w:proofErr w:type="spellStart"/>
+      <w:r>
+        <w:rPr>
+          <w:rFonts w:ascii="Arial" w:hAnsi="Arial" w:cs="Arial"/>
+          <w:sz w:val="24"/>
+          <w:szCs w:val="24"/>
+        </w:rPr>
+        <w:t>capacidad_autobus</w:t>
+      </w:r>
+      <w:proofErr w:type="spellEnd"/>
+      <w:r>
+        <w:rPr>
+          <w:rFonts w:ascii="Arial" w:hAnsi="Arial" w:cs="Arial"/>
+          <w:sz w:val="24"/>
+          <w:szCs w:val="24"/>
+        </w:rPr>
+        <w:t xml:space="preserve"> − </w:t>
+      </w:r>
+      <w:proofErr w:type="spellStart"/>
+      <w:r>
+        <w:rPr>
+          <w:rFonts w:ascii="Arial" w:hAnsi="Arial" w:cs="Arial"/>
+          <w:sz w:val="24"/>
+          <w:szCs w:val="24"/>
+        </w:rPr>
+        <w:t>cantidad_boletos_registrados</w:t>
+      </w:r>
+      <w:proofErr w:type="spellEnd"/>
+      <w:r>
+        <w:rPr>
+          <w:rFonts w:ascii="Arial" w:hAnsi="Arial" w:cs="Arial"/>
+          <w:sz w:val="24"/>
+          <w:szCs w:val="24"/>
+        </w:rPr>
+        <w:t>.</w:t>
+      </w:r>
+    </w:p>
+    <w:p>
+      <w:pPr>
+        <w:pStyle w:val="Listaconvietas"/>
+        <w:jc w:val="both"/>
+        <w:rPr>
+          <w:rFonts w:ascii="Arial" w:hAnsi="Arial" w:cs="Arial"/>
+          <w:sz w:val="24"/>
+          <w:szCs w:val="24"/>
+        </w:rPr>
+      </w:pPr>
+      <w:r>
+        <w:rPr>
+          <w:rFonts w:ascii="Arial" w:hAnsi="Arial" w:cs="Arial"/>
+          <w:sz w:val="24"/>
+          <w:szCs w:val="24"/>
+        </w:rPr>
+        <w:t xml:space="preserve">Un viaje está "lleno" cuando </w:t>
+      </w:r>
+      <w:proofErr w:type="spellStart"/>
+      <w:r>
+        <w:rPr>
+          <w:rFonts w:ascii="Arial" w:hAnsi="Arial" w:cs="Arial"/>
+          <w:sz w:val="24"/>
+          <w:szCs w:val="24"/>
+        </w:rPr>
+        <w:t>asientos_disponibles</w:t>
+      </w:r>
+      <w:proofErr w:type="spellEnd"/>
+      <w:r>
+        <w:rPr>
+          <w:rFonts w:ascii="Arial" w:hAnsi="Arial" w:cs="Arial"/>
+          <w:sz w:val="24"/>
+          <w:szCs w:val="24"/>
+        </w:rPr>
+        <w:t xml:space="preserve"> ≤ 0.</w:t>
+      </w:r>
+    </w:p>
+    <w:p>
+      <w:pPr>
+        <w:pStyle w:val="Ttulo2"/>
+        <w:jc w:val="both"/>
+        <w:rPr>
+          <w:rFonts w:ascii="Arial" w:hAnsi="Arial" w:cs="Arial"/>
+          <w:color w:val="auto"/>
+          <w:sz w:val="24"/>
+          <w:szCs w:val="24"/>
+        </w:rPr>
+      </w:pPr>
+      <w:r>
+        <w:rPr>
+          <w:rFonts w:ascii="Arial" w:hAnsi="Arial" w:cs="Arial"/>
+          <w:color w:val="auto"/>
+          <w:sz w:val="24"/>
+          <w:szCs w:val="24"/>
+        </w:rPr>
+        <w:t>4. Gestión de Boletos</w:t>
+      </w:r>
+    </w:p>
+    <w:p>
+      <w:pPr>
+        <w:pStyle w:val="Listaconvietas"/>
+        <w:jc w:val="both"/>
+        <w:rPr>
+          <w:rFonts w:ascii="Arial" w:hAnsi="Arial" w:cs="Arial"/>
+          <w:sz w:val="24"/>
+          <w:szCs w:val="24"/>
+        </w:rPr>
+      </w:pPr>
+      <w:r>
+        <w:rPr>
+          <w:rFonts w:ascii="Arial" w:hAnsi="Arial" w:cs="Arial"/>
+          <w:sz w:val="24"/>
+          <w:szCs w:val="24"/>
+        </w:rPr>
+        <w:t>Cada boleto DEBE asociarse a un viaje válido (</w:t>
+      </w:r>
+      <w:proofErr w:type="spellStart"/>
+      <w:r>
+        <w:rPr>
+          <w:rFonts w:ascii="Arial" w:hAnsi="Arial" w:cs="Arial"/>
+          <w:sz w:val="24"/>
+          <w:szCs w:val="24"/>
+        </w:rPr>
+        <w:t>id_viaje</w:t>
+      </w:r>
+      <w:proofErr w:type="spellEnd"/>
+      <w:r>
+        <w:rPr>
+          <w:rFonts w:ascii="Arial" w:hAnsi="Arial" w:cs="Arial"/>
+          <w:sz w:val="24"/>
+          <w:szCs w:val="24"/>
+        </w:rPr>
+        <w:t>).</w:t>
+      </w:r>
+    </w:p>
+    <w:p>
+      <w:pPr>
+        <w:pStyle w:val="Listaconvietas"/>
+        <w:jc w:val="both"/>
+        <w:rPr>
+          <w:rFonts w:ascii="Arial" w:hAnsi="Arial" w:cs="Arial"/>
+          <w:sz w:val="24"/>
+          <w:szCs w:val="24"/>
+        </w:rPr>
+      </w:pPr>
+      <w:r>
+        <w:rPr>
+          <w:rFonts w:ascii="Arial" w:hAnsi="Arial" w:cs="Arial"/>
+          <w:sz w:val="24"/>
+          <w:szCs w:val="24"/>
+        </w:rPr>
+        <w:t>Tiene número de asiento (valor numérico).</w:t>
+      </w:r>
+    </w:p>
+    <w:p>
+      <w:pPr>
+        <w:pStyle w:val="Listaconvietas"/>
+        <w:jc w:val="both"/>
+        <w:rPr>
+          <w:rFonts w:ascii="Arial" w:hAnsi="Arial" w:cs="Arial"/>
+          <w:sz w:val="24"/>
+          <w:szCs w:val="24"/>
+        </w:rPr>
+      </w:pPr>
+      <w:r>
+        <w:rPr>
+          <w:rFonts w:ascii="Arial" w:hAnsi="Arial" w:cs="Arial"/>
+          <w:sz w:val="24"/>
+          <w:szCs w:val="24"/>
+        </w:rPr>
+        <w:t>No se puede crear boleto si el viaje está lleno.</w:t>
+      </w:r>
+    </w:p>
+    <w:p>
+      <w:pPr>
+        <w:pStyle w:val="Listaconvietas"/>
+        <w:jc w:val="both"/>
+        <w:rPr>
+          <w:rFonts w:ascii="Arial" w:hAnsi="Arial" w:cs="Arial"/>
+          <w:sz w:val="24"/>
+          <w:szCs w:val="24"/>
+        </w:rPr>
+      </w:pPr>
+      <w:r>
+        <w:rPr>
+          <w:rFonts w:ascii="Arial" w:hAnsi="Arial" w:cs="Arial"/>
+          <w:sz w:val="24"/>
+          <w:szCs w:val="24"/>
+        </w:rPr>
+        <w:t xml:space="preserve">El costo final se genera automáticamente (basado en </w:t>
+      </w:r>
+      <w:proofErr w:type="spellStart"/>
+      <w:r>
+        <w:rPr>
+          <w:rFonts w:ascii="Arial" w:hAnsi="Arial" w:cs="Arial"/>
+          <w:sz w:val="24"/>
+          <w:szCs w:val="24"/>
+        </w:rPr>
+        <w:t>costo_base</w:t>
+      </w:r>
+      <w:proofErr w:type="spellEnd"/>
+      <w:r>
+        <w:rPr>
+          <w:rFonts w:ascii="Arial" w:hAnsi="Arial" w:cs="Arial"/>
+          <w:sz w:val="24"/>
+          <w:szCs w:val="24"/>
+        </w:rPr>
+        <w:t xml:space="preserve"> del viaje).</w:t>
+      </w:r>
+    </w:p>
+    <w:p>
+      <w:pPr>
+        <w:pStyle w:val="Listaconvietas"/>
+        <w:jc w:val="both"/>
+        <w:rPr>
+          <w:rFonts w:ascii="Arial" w:hAnsi="Arial" w:cs="Arial"/>
+          <w:sz w:val="24"/>
+          <w:szCs w:val="24"/>
+        </w:rPr>
+      </w:pPr>
+      <w:r>
+        <w:rPr>
+          <w:rFonts w:ascii="Arial" w:hAnsi="Arial" w:cs="Arial"/>
+          <w:sz w:val="24"/>
+          <w:szCs w:val="24"/>
+        </w:rPr>
+        <w:t>Registra datos del cliente (nombre, teléfono, correo).</w:t>
+      </w:r>
+    </w:p>
+    <w:p>
+      <w:pPr>
+        <w:pStyle w:val="Listaconvietas"/>
+        <w:jc w:val="both"/>
+        <w:rPr>
+          <w:rFonts w:ascii="Arial" w:hAnsi="Arial" w:cs="Arial"/>
+          <w:sz w:val="24"/>
+          <w:szCs w:val="24"/>
+        </w:rPr>
+      </w:pPr>
+      <w:r>
+        <w:rPr>
+          <w:rFonts w:ascii="Arial" w:hAnsi="Arial" w:cs="Arial"/>
+          <w:sz w:val="24"/>
+          <w:szCs w:val="24"/>
+        </w:rPr>
+        <w:t>Los asientos reservados disminuyen los asientos disponibles del viaje.</w:t>
+      </w:r>
+    </w:p>
+    <w:p>
+      <w:pPr>
         <w:pStyle w:val="Listaconnmeros"/>
         <w:spacing w:after="40"/>
-        <w:rPr>
-          <w:rFonts w:ascii="Arial" w:hAnsi="Arial" w:cs="Arial"/>
-          <w:sz w:val="24"/>
-          <w:szCs w:val="24"/>
-        </w:rPr>
-      </w:pPr>
-      <w:r>
-        <w:rPr>
-          <w:rFonts w:ascii="Arial" w:hAnsi="Arial" w:cs="Arial"/>
-          <w:sz w:val="24"/>
-          <w:szCs w:val="24"/>
-        </w:rPr>
-        <w:t xml:space="preserve">Ejecutar gui_app.py para abrir la interfaz </w:t>
-      </w:r>
-      <w:r>
-        <w:rPr>
-          <w:rFonts w:ascii="Arial" w:hAnsi="Arial" w:cs="Arial"/>
-          <w:sz w:val="24"/>
-          <w:szCs w:val="24"/>
-        </w:rPr>
-        <w:t>gráfica</w:t>
-      </w:r>
-      <w:r>
-        <w:rPr>
-          <w:rFonts w:ascii="Arial" w:hAnsi="Arial" w:cs="Arial"/>
-          <w:sz w:val="24"/>
-          <w:szCs w:val="24"/>
-        </w:rPr>
-        <w:t>.</w:t>
+        <w:jc w:val="both"/>
+        <w:rPr>
+          <w:rFonts w:ascii="Arial" w:hAnsi="Arial" w:cs="Arial"/>
+          <w:sz w:val="24"/>
+          <w:szCs w:val="24"/>
+        </w:rPr>
+      </w:pPr>
+      <w:r>
+        <w:rPr>
+          <w:rFonts w:ascii="Arial" w:hAnsi="Arial" w:cs="Arial"/>
+          <w:sz w:val="24"/>
+          <w:szCs w:val="24"/>
+        </w:rPr>
+        <w:t xml:space="preserve">Consultar boletos o reportes para revisar la </w:t>
+      </w:r>
+      <w:r>
+        <w:rPr>
+          <w:rFonts w:ascii="Arial" w:hAnsi="Arial" w:cs="Arial"/>
+          <w:sz w:val="24"/>
+          <w:szCs w:val="24"/>
+        </w:rPr>
+        <w:t>información</w:t>
+      </w:r>
+      <w:r>
+        <w:rPr>
+          <w:rFonts w:ascii="Arial" w:hAnsi="Arial" w:cs="Arial"/>
+          <w:sz w:val="24"/>
+          <w:szCs w:val="24"/>
+        </w:rPr>
+        <w:t xml:space="preserve"> generada.</w:t>
       </w:r>
     </w:p>
     <w:p>
       <w:pPr>
-        <w:pStyle w:val="Listaconnmeros"/>
-        <w:spacing w:after="40"/>
-        <w:rPr>
-          <w:rFonts w:ascii="Arial" w:hAnsi="Arial" w:cs="Arial"/>
-          <w:sz w:val="24"/>
-          <w:szCs w:val="24"/>
-        </w:rPr>
-      </w:pPr>
-      <w:r>
-        <w:rPr>
-          <w:rFonts w:ascii="Arial" w:hAnsi="Arial" w:cs="Arial"/>
-          <w:sz w:val="24"/>
-          <w:szCs w:val="24"/>
-        </w:rPr>
-        <w:t xml:space="preserve">Ingresar usuario y </w:t>
-      </w:r>
-      <w:r>
-        <w:rPr>
-          <w:rFonts w:ascii="Arial" w:hAnsi="Arial" w:cs="Arial"/>
-          <w:sz w:val="24"/>
-          <w:szCs w:val="24"/>
-        </w:rPr>
-        <w:t>contraseña</w:t>
-      </w:r>
-      <w:r>
-        <w:rPr>
-          <w:rFonts w:ascii="Arial" w:hAnsi="Arial" w:cs="Arial"/>
-          <w:sz w:val="24"/>
-          <w:szCs w:val="24"/>
-        </w:rPr>
-        <w:t xml:space="preserve"> registrados en empleados.txt.</w:t>
+        <w:pStyle w:val="Ttulo2"/>
+        <w:jc w:val="both"/>
+        <w:rPr>
+          <w:rFonts w:ascii="Arial" w:hAnsi="Arial" w:cs="Arial"/>
+          <w:color w:val="auto"/>
+          <w:sz w:val="24"/>
+          <w:szCs w:val="24"/>
+        </w:rPr>
+      </w:pPr>
+      <w:r>
+        <w:rPr>
+          <w:rFonts w:ascii="Arial" w:hAnsi="Arial" w:cs="Arial"/>
+          <w:color w:val="auto"/>
+          <w:sz w:val="24"/>
+          <w:szCs w:val="24"/>
+        </w:rPr>
+        <w:t>5. Gestión de Empleados y Autenticación</w:t>
       </w:r>
     </w:p>
     <w:p>
       <w:pPr>
-        <w:pStyle w:val="Listaconnmeros"/>
-        <w:spacing w:after="40"/>
-        <w:rPr>
-          <w:rFonts w:ascii="Arial" w:hAnsi="Arial" w:cs="Arial"/>
-          <w:sz w:val="24"/>
-          <w:szCs w:val="24"/>
-        </w:rPr>
-      </w:pPr>
-      <w:r>
-        <w:rPr>
-          <w:rFonts w:ascii="Arial" w:hAnsi="Arial" w:cs="Arial"/>
-          <w:sz w:val="24"/>
-          <w:szCs w:val="24"/>
-        </w:rPr>
-        <w:t>Seleccionar la tabla que se desea consultar o administrar.</w:t>
+        <w:pStyle w:val="Listaconvietas"/>
+        <w:jc w:val="both"/>
+        <w:rPr>
+          <w:rFonts w:ascii="Arial" w:hAnsi="Arial" w:cs="Arial"/>
+          <w:sz w:val="24"/>
+          <w:szCs w:val="24"/>
+        </w:rPr>
+      </w:pPr>
+      <w:r>
+        <w:rPr>
+          <w:rFonts w:ascii="Arial" w:hAnsi="Arial" w:cs="Arial"/>
+          <w:sz w:val="24"/>
+          <w:szCs w:val="24"/>
+        </w:rPr>
+        <w:t>Cada empleado tiene: nombre, usuario y contraseña encriptada.</w:t>
       </w:r>
     </w:p>
     <w:p>
       <w:pPr>
-        <w:pStyle w:val="Listaconnmeros"/>
-        <w:spacing w:after="40"/>
-        <w:rPr>
-          <w:rFonts w:ascii="Arial" w:hAnsi="Arial" w:cs="Arial"/>
-          <w:sz w:val="24"/>
-          <w:szCs w:val="24"/>
-        </w:rPr>
-      </w:pPr>
-      <w:r>
-        <w:rPr>
-          <w:rFonts w:ascii="Arial" w:hAnsi="Arial" w:cs="Arial"/>
-          <w:sz w:val="24"/>
-          <w:szCs w:val="24"/>
-        </w:rPr>
-        <w:t xml:space="preserve">Usar los botones de nuevo, editar, eliminar o refrescar </w:t>
-      </w:r>
-      <w:r>
-        <w:rPr>
-          <w:rFonts w:ascii="Arial" w:hAnsi="Arial" w:cs="Arial"/>
-          <w:sz w:val="24"/>
-          <w:szCs w:val="24"/>
-        </w:rPr>
-        <w:t>según</w:t>
-      </w:r>
-      <w:r>
-        <w:rPr>
-          <w:rFonts w:ascii="Arial" w:hAnsi="Arial" w:cs="Arial"/>
-          <w:sz w:val="24"/>
-          <w:szCs w:val="24"/>
-        </w:rPr>
-        <w:t xml:space="preserve"> la </w:t>
-      </w:r>
-      <w:r>
-        <w:rPr>
-          <w:rFonts w:ascii="Arial" w:hAnsi="Arial" w:cs="Arial"/>
-          <w:sz w:val="24"/>
-          <w:szCs w:val="24"/>
-        </w:rPr>
-        <w:t>operación</w:t>
-      </w:r>
-      <w:r>
-        <w:rPr>
-          <w:rFonts w:ascii="Arial" w:hAnsi="Arial" w:cs="Arial"/>
-          <w:sz w:val="24"/>
-          <w:szCs w:val="24"/>
-        </w:rPr>
-        <w:t xml:space="preserve"> requerida.</w:t>
+        <w:pStyle w:val="Listaconvietas"/>
+        <w:jc w:val="both"/>
+        <w:rPr>
+          <w:rFonts w:ascii="Arial" w:hAnsi="Arial" w:cs="Arial"/>
+          <w:sz w:val="24"/>
+          <w:szCs w:val="24"/>
+        </w:rPr>
+      </w:pPr>
+      <w:r>
+        <w:rPr>
+          <w:rFonts w:ascii="Arial" w:hAnsi="Arial" w:cs="Arial"/>
+          <w:sz w:val="24"/>
+          <w:szCs w:val="24"/>
+        </w:rPr>
+        <w:t>Los usuarios DEBEN ser únicos en el sistema.</w:t>
       </w:r>
     </w:p>
     <w:p>
       <w:pPr>
-        <w:pStyle w:val="Listaconnmeros"/>
-        <w:spacing w:after="40"/>
-        <w:rPr>
-          <w:rFonts w:ascii="Arial" w:hAnsi="Arial" w:cs="Arial"/>
-          <w:sz w:val="24"/>
-          <w:szCs w:val="24"/>
-        </w:rPr>
-      </w:pPr>
-      <w:r>
-        <w:rPr>
-          <w:rFonts w:ascii="Arial" w:hAnsi="Arial" w:cs="Arial"/>
-          <w:sz w:val="24"/>
-          <w:szCs w:val="24"/>
-        </w:rPr>
-        <w:t>Guardar los cambios para actualizar el archivo TXT correspondiente.</w:t>
+        <w:pStyle w:val="Listaconvietas"/>
+        <w:jc w:val="both"/>
+        <w:rPr>
+          <w:rFonts w:ascii="Arial" w:hAnsi="Arial" w:cs="Arial"/>
+          <w:sz w:val="24"/>
+          <w:szCs w:val="24"/>
+        </w:rPr>
+      </w:pPr>
+      <w:r>
+        <w:rPr>
+          <w:rFonts w:ascii="Arial" w:hAnsi="Arial" w:cs="Arial"/>
+          <w:sz w:val="24"/>
+          <w:szCs w:val="24"/>
+        </w:rPr>
+        <w:t>Se genera usuario automático a partir del nombre.</w:t>
       </w:r>
     </w:p>
     <w:p>
       <w:pPr>
-        <w:pStyle w:val="Listaconnmeros"/>
-        <w:spacing w:after="40"/>
-        <w:rPr>
-          <w:rFonts w:ascii="Arial" w:hAnsi="Arial" w:cs="Arial"/>
-          <w:sz w:val="24"/>
-          <w:szCs w:val="24"/>
-        </w:rPr>
-      </w:pPr>
-      <w:r>
-        <w:rPr>
-          <w:rFonts w:ascii="Arial" w:hAnsi="Arial" w:cs="Arial"/>
-          <w:sz w:val="24"/>
-          <w:szCs w:val="24"/>
-        </w:rPr>
-        <w:t xml:space="preserve">Consultar boletos o reportes para revisar la </w:t>
-      </w:r>
-      <w:r>
-        <w:rPr>
-          <w:rFonts w:ascii="Arial" w:hAnsi="Arial" w:cs="Arial"/>
-          <w:sz w:val="24"/>
-          <w:szCs w:val="24"/>
-        </w:rPr>
-        <w:t>información</w:t>
-      </w:r>
-      <w:r>
-        <w:rPr>
-          <w:rFonts w:ascii="Arial" w:hAnsi="Arial" w:cs="Arial"/>
-          <w:sz w:val="24"/>
-          <w:szCs w:val="24"/>
-        </w:rPr>
-        <w:t xml:space="preserve"> generada.</w:t>
+        <w:pStyle w:val="Listaconvietas"/>
+        <w:jc w:val="both"/>
+        <w:rPr>
+          <w:rFonts w:ascii="Arial" w:hAnsi="Arial" w:cs="Arial"/>
+          <w:sz w:val="24"/>
+          <w:szCs w:val="24"/>
+        </w:rPr>
+      </w:pPr>
+      <w:r>
+        <w:rPr>
+          <w:rFonts w:ascii="Arial" w:hAnsi="Arial" w:cs="Arial"/>
+          <w:sz w:val="24"/>
+          <w:szCs w:val="24"/>
+        </w:rPr>
+        <w:t xml:space="preserve">Las contraseñas están </w:t>
+      </w:r>
+      <w:proofErr w:type="spellStart"/>
+      <w:r>
+        <w:rPr>
+          <w:rFonts w:ascii="Arial" w:hAnsi="Arial" w:cs="Arial"/>
+          <w:sz w:val="24"/>
+          <w:szCs w:val="24"/>
+        </w:rPr>
+        <w:t>hasheadas</w:t>
+      </w:r>
+      <w:proofErr w:type="spellEnd"/>
+      <w:r>
+        <w:rPr>
+          <w:rFonts w:ascii="Arial" w:hAnsi="Arial" w:cs="Arial"/>
+          <w:sz w:val="24"/>
+          <w:szCs w:val="24"/>
+        </w:rPr>
+        <w:t xml:space="preserve"> (no en texto plano).</w:t>
       </w:r>
     </w:p>
     <w:p>
       <w:pPr>
+        <w:pStyle w:val="Listaconvietas"/>
+        <w:jc w:val="both"/>
+        <w:rPr>
+          <w:rFonts w:ascii="Arial" w:hAnsi="Arial" w:cs="Arial"/>
+          <w:sz w:val="24"/>
+          <w:szCs w:val="24"/>
+        </w:rPr>
+      </w:pPr>
+      <w:r>
+        <w:rPr>
+          <w:rFonts w:ascii="Arial" w:hAnsi="Arial" w:cs="Arial"/>
+          <w:sz w:val="24"/>
+          <w:szCs w:val="24"/>
+        </w:rPr>
+        <w:t xml:space="preserve">Credenciales default — </w:t>
+      </w:r>
+      <w:proofErr w:type="spellStart"/>
+      <w:r>
+        <w:rPr>
+          <w:rFonts w:ascii="Arial" w:hAnsi="Arial" w:cs="Arial"/>
+          <w:sz w:val="24"/>
+          <w:szCs w:val="24"/>
+        </w:rPr>
+        <w:t>Admin</w:t>
+      </w:r>
+      <w:proofErr w:type="spellEnd"/>
+      <w:r>
+        <w:rPr>
+          <w:rFonts w:ascii="Arial" w:hAnsi="Arial" w:cs="Arial"/>
+          <w:sz w:val="24"/>
+          <w:szCs w:val="24"/>
+        </w:rPr>
+        <w:t xml:space="preserve">: </w:t>
+      </w:r>
+      <w:proofErr w:type="spellStart"/>
+      <w:r>
+        <w:rPr>
+          <w:rFonts w:ascii="Arial" w:hAnsi="Arial" w:cs="Arial"/>
+          <w:sz w:val="24"/>
+          <w:szCs w:val="24"/>
+        </w:rPr>
+        <w:t>admin</w:t>
+      </w:r>
+      <w:proofErr w:type="spellEnd"/>
+      <w:r>
+        <w:rPr>
+          <w:rFonts w:ascii="Arial" w:hAnsi="Arial" w:cs="Arial"/>
+          <w:sz w:val="24"/>
+          <w:szCs w:val="24"/>
+        </w:rPr>
+        <w:t xml:space="preserve"> / admin123 | Usuario: usuario / usuario123.</w:t>
+      </w:r>
+    </w:p>
+    <w:p>
+      <w:pPr>
+        <w:pStyle w:val="Ttulo2"/>
+        <w:jc w:val="both"/>
+        <w:rPr>
+          <w:rFonts w:ascii="Arial" w:hAnsi="Arial" w:cs="Arial"/>
+          <w:color w:val="auto"/>
+          <w:sz w:val="24"/>
+          <w:szCs w:val="24"/>
+        </w:rPr>
+      </w:pPr>
+      <w:r>
+        <w:rPr>
+          <w:rFonts w:ascii="Arial" w:hAnsi="Arial" w:cs="Arial"/>
+          <w:color w:val="auto"/>
+          <w:sz w:val="24"/>
+          <w:szCs w:val="24"/>
+        </w:rPr>
+        <w:t>6. Sistema de Permisos Granulares</w:t>
+      </w:r>
+    </w:p>
+    <w:p>
+      <w:pPr>
+        <w:pStyle w:val="Listaconvietas"/>
+        <w:jc w:val="both"/>
+        <w:rPr>
+          <w:rFonts w:ascii="Arial" w:hAnsi="Arial" w:cs="Arial"/>
+          <w:sz w:val="24"/>
+          <w:szCs w:val="24"/>
+        </w:rPr>
+      </w:pPr>
+      <w:r>
+        <w:rPr>
+          <w:rFonts w:ascii="Arial" w:hAnsi="Arial" w:cs="Arial"/>
+          <w:sz w:val="24"/>
+          <w:szCs w:val="24"/>
+        </w:rPr>
+        <w:t>Solo administradores pueden gestionar permisos.</w:t>
+      </w:r>
+    </w:p>
+    <w:p>
+      <w:pPr>
+        <w:pStyle w:val="Listaconvietas"/>
+        <w:jc w:val="both"/>
+        <w:rPr>
+          <w:rFonts w:ascii="Arial" w:hAnsi="Arial" w:cs="Arial"/>
+          <w:sz w:val="24"/>
+          <w:szCs w:val="24"/>
+        </w:rPr>
+      </w:pPr>
+      <w:proofErr w:type="spellStart"/>
+      <w:r>
+        <w:rPr>
+          <w:rFonts w:ascii="Arial" w:hAnsi="Arial" w:cs="Arial"/>
+          <w:sz w:val="24"/>
+          <w:szCs w:val="24"/>
+        </w:rPr>
+        <w:t>permiso_altas</w:t>
+      </w:r>
+      <w:proofErr w:type="spellEnd"/>
+      <w:r>
+        <w:rPr>
+          <w:rFonts w:ascii="Arial" w:hAnsi="Arial" w:cs="Arial"/>
+          <w:sz w:val="24"/>
+          <w:szCs w:val="24"/>
+        </w:rPr>
+        <w:t>: puede crear registros.</w:t>
+      </w:r>
+    </w:p>
+    <w:p>
+      <w:pPr>
+        <w:pStyle w:val="Listaconvietas"/>
+        <w:jc w:val="both"/>
+        <w:rPr>
+          <w:rFonts w:ascii="Arial" w:hAnsi="Arial" w:cs="Arial"/>
+          <w:sz w:val="24"/>
+          <w:szCs w:val="24"/>
+        </w:rPr>
+      </w:pPr>
+      <w:proofErr w:type="spellStart"/>
+      <w:r>
+        <w:rPr>
+          <w:rFonts w:ascii="Arial" w:hAnsi="Arial" w:cs="Arial"/>
+          <w:sz w:val="24"/>
+          <w:szCs w:val="24"/>
+        </w:rPr>
+        <w:t>permiso_bajas</w:t>
+      </w:r>
+      <w:proofErr w:type="spellEnd"/>
+      <w:r>
+        <w:rPr>
+          <w:rFonts w:ascii="Arial" w:hAnsi="Arial" w:cs="Arial"/>
+          <w:sz w:val="24"/>
+          <w:szCs w:val="24"/>
+        </w:rPr>
+        <w:t>: puede eliminar registros.</w:t>
+      </w:r>
+    </w:p>
+    <w:p>
+      <w:pPr>
+        <w:pStyle w:val="Listaconvietas"/>
+        <w:jc w:val="both"/>
+        <w:rPr>
+          <w:rFonts w:ascii="Arial" w:hAnsi="Arial" w:cs="Arial"/>
+          <w:sz w:val="24"/>
+          <w:szCs w:val="24"/>
+        </w:rPr>
+      </w:pPr>
+      <w:proofErr w:type="spellStart"/>
+      <w:r>
+        <w:rPr>
+          <w:rFonts w:ascii="Arial" w:hAnsi="Arial" w:cs="Arial"/>
+          <w:sz w:val="24"/>
+          <w:szCs w:val="24"/>
+        </w:rPr>
+        <w:t>permiso_modificaciones</w:t>
+      </w:r>
+      <w:proofErr w:type="spellEnd"/>
+      <w:r>
+        <w:rPr>
+          <w:rFonts w:ascii="Arial" w:hAnsi="Arial" w:cs="Arial"/>
+          <w:sz w:val="24"/>
+          <w:szCs w:val="24"/>
+        </w:rPr>
+        <w:t>: puede editar registros.</w:t>
+      </w:r>
+    </w:p>
+    <w:p>
+      <w:pPr>
+        <w:pStyle w:val="Listaconvietas"/>
+        <w:jc w:val="both"/>
+        <w:rPr>
+          <w:rFonts w:ascii="Arial" w:hAnsi="Arial" w:cs="Arial"/>
+          <w:sz w:val="24"/>
+          <w:szCs w:val="24"/>
+        </w:rPr>
+      </w:pPr>
+      <w:proofErr w:type="spellStart"/>
+      <w:r>
+        <w:rPr>
+          <w:rFonts w:ascii="Arial" w:hAnsi="Arial" w:cs="Arial"/>
+          <w:sz w:val="24"/>
+          <w:szCs w:val="24"/>
+        </w:rPr>
+        <w:lastRenderedPageBreak/>
+        <w:t>interfaz_accedida</w:t>
+      </w:r>
+      <w:proofErr w:type="spellEnd"/>
+      <w:r>
+        <w:rPr>
+          <w:rFonts w:ascii="Arial" w:hAnsi="Arial" w:cs="Arial"/>
+          <w:sz w:val="24"/>
+          <w:szCs w:val="24"/>
+        </w:rPr>
+        <w:t>: especifica acceso (Usuario/</w:t>
+      </w:r>
+      <w:proofErr w:type="spellStart"/>
+      <w:r>
+        <w:rPr>
+          <w:rFonts w:ascii="Arial" w:hAnsi="Arial" w:cs="Arial"/>
+          <w:sz w:val="24"/>
+          <w:szCs w:val="24"/>
+        </w:rPr>
+        <w:t>Admin</w:t>
+      </w:r>
+      <w:proofErr w:type="spellEnd"/>
+      <w:r>
+        <w:rPr>
+          <w:rFonts w:ascii="Arial" w:hAnsi="Arial" w:cs="Arial"/>
+          <w:sz w:val="24"/>
+          <w:szCs w:val="24"/>
+        </w:rPr>
+        <w:t>).</w:t>
+      </w:r>
+    </w:p>
+    <w:p>
+      <w:pPr>
+        <w:pStyle w:val="Ttulo2"/>
+        <w:jc w:val="both"/>
+        <w:rPr>
+          <w:rFonts w:ascii="Arial" w:hAnsi="Arial" w:cs="Arial"/>
+          <w:color w:val="auto"/>
+          <w:sz w:val="24"/>
+          <w:szCs w:val="24"/>
+        </w:rPr>
+      </w:pPr>
+      <w:r>
+        <w:rPr>
+          <w:rFonts w:ascii="Arial" w:hAnsi="Arial" w:cs="Arial"/>
+          <w:color w:val="auto"/>
+          <w:sz w:val="24"/>
+          <w:szCs w:val="24"/>
+        </w:rPr>
+        <w:t>7. Acceso por Rol</w:t>
+      </w:r>
+    </w:p>
+    <w:p>
+      <w:pPr>
+        <w:pStyle w:val="Listaconvietas"/>
+        <w:jc w:val="both"/>
+        <w:rPr>
+          <w:rFonts w:ascii="Arial" w:hAnsi="Arial" w:cs="Arial"/>
+          <w:sz w:val="24"/>
+          <w:szCs w:val="24"/>
+        </w:rPr>
+      </w:pPr>
+      <w:r>
+        <w:rPr>
+          <w:rFonts w:ascii="Arial" w:hAnsi="Arial" w:cs="Arial"/>
+          <w:sz w:val="24"/>
+          <w:szCs w:val="24"/>
+        </w:rPr>
+        <w:t>Usuarios Normales pueden acceder a: Rutas, Viajes, Boletos y Reportes.</w:t>
+      </w:r>
+    </w:p>
+    <w:p>
+      <w:pPr>
+        <w:pStyle w:val="Listaconvietas"/>
+        <w:jc w:val="both"/>
+        <w:rPr>
+          <w:rFonts w:ascii="Arial" w:hAnsi="Arial" w:cs="Arial"/>
+          <w:sz w:val="24"/>
+          <w:szCs w:val="24"/>
+        </w:rPr>
+      </w:pPr>
+      <w:r>
+        <w:rPr>
+          <w:rFonts w:ascii="Arial" w:hAnsi="Arial" w:cs="Arial"/>
+          <w:sz w:val="24"/>
+          <w:szCs w:val="24"/>
+        </w:rPr>
+        <w:t>Administradores pueden acceder a todo lo anterior más: Autobuses, Empleados, Administradores y Accesos (gestión de permisos).</w:t>
+      </w:r>
+    </w:p>
+    <w:p>
+      <w:pPr>
+        <w:pStyle w:val="Ttulo2"/>
+        <w:jc w:val="both"/>
+        <w:rPr>
+          <w:rFonts w:ascii="Arial" w:hAnsi="Arial" w:cs="Arial"/>
+          <w:color w:val="auto"/>
+          <w:sz w:val="24"/>
+          <w:szCs w:val="24"/>
+        </w:rPr>
+      </w:pPr>
+      <w:r>
+        <w:rPr>
+          <w:rFonts w:ascii="Arial" w:hAnsi="Arial" w:cs="Arial"/>
+          <w:color w:val="auto"/>
+          <w:sz w:val="24"/>
+          <w:szCs w:val="24"/>
+        </w:rPr>
+        <w:t>8. Gestión de Reportes</w:t>
+      </w:r>
+    </w:p>
+    <w:p>
+      <w:pPr>
+        <w:pStyle w:val="Listaconvietas"/>
+        <w:jc w:val="both"/>
+        <w:rPr>
+          <w:rFonts w:ascii="Arial" w:hAnsi="Arial" w:cs="Arial"/>
+          <w:sz w:val="24"/>
+          <w:szCs w:val="24"/>
+        </w:rPr>
+      </w:pPr>
+      <w:r>
+        <w:rPr>
+          <w:rFonts w:ascii="Arial" w:hAnsi="Arial" w:cs="Arial"/>
+          <w:sz w:val="24"/>
+          <w:szCs w:val="24"/>
+        </w:rPr>
+        <w:t>Cada reporte DEBE asociarse a un viaje válido (</w:t>
+      </w:r>
+      <w:proofErr w:type="spellStart"/>
+      <w:r>
+        <w:rPr>
+          <w:rFonts w:ascii="Arial" w:hAnsi="Arial" w:cs="Arial"/>
+          <w:sz w:val="24"/>
+          <w:szCs w:val="24"/>
+        </w:rPr>
+        <w:t>id_viaje</w:t>
+      </w:r>
+      <w:proofErr w:type="spellEnd"/>
+      <w:r>
+        <w:rPr>
+          <w:rFonts w:ascii="Arial" w:hAnsi="Arial" w:cs="Arial"/>
+          <w:sz w:val="24"/>
+          <w:szCs w:val="24"/>
+        </w:rPr>
+        <w:t>).</w:t>
+      </w:r>
+    </w:p>
+    <w:p>
+      <w:pPr>
+        <w:pStyle w:val="Listaconvietas"/>
+        <w:jc w:val="both"/>
+        <w:rPr>
+          <w:rFonts w:ascii="Arial" w:hAnsi="Arial" w:cs="Arial"/>
+          <w:sz w:val="24"/>
+          <w:szCs w:val="24"/>
+        </w:rPr>
+      </w:pPr>
+      <w:r>
+        <w:rPr>
+          <w:rFonts w:ascii="Arial" w:hAnsi="Arial" w:cs="Arial"/>
+          <w:sz w:val="24"/>
+          <w:szCs w:val="24"/>
+        </w:rPr>
+        <w:t>Incluye descripción de incidencia y fecha (YYYY-MM-DD).</w:t>
+      </w:r>
+    </w:p>
+    <w:p>
+      <w:pPr>
+        <w:pStyle w:val="Listaconvietas"/>
+        <w:jc w:val="both"/>
+        <w:rPr>
+          <w:rFonts w:ascii="Arial" w:hAnsi="Arial" w:cs="Arial"/>
+          <w:sz w:val="24"/>
+          <w:szCs w:val="24"/>
+        </w:rPr>
+      </w:pPr>
+      <w:r>
+        <w:rPr>
+          <w:rFonts w:ascii="Arial" w:hAnsi="Arial" w:cs="Arial"/>
+          <w:sz w:val="24"/>
+          <w:szCs w:val="24"/>
+        </w:rPr>
+        <w:t>El sistema genera reportes resumidos: total de reportes registrados, total de viajes registrados, total de boletos emitidos y ruta con más viajes.</w:t>
+      </w:r>
+    </w:p>
+    <w:p>
+      <w:pPr>
+        <w:pStyle w:val="Ttulo2"/>
+        <w:jc w:val="both"/>
+        <w:rPr>
+          <w:rFonts w:ascii="Arial" w:hAnsi="Arial" w:cs="Arial"/>
+          <w:color w:val="auto"/>
+          <w:sz w:val="24"/>
+          <w:szCs w:val="24"/>
+        </w:rPr>
+      </w:pPr>
+      <w:r>
+        <w:rPr>
+          <w:rFonts w:ascii="Arial" w:hAnsi="Arial" w:cs="Arial"/>
+          <w:color w:val="auto"/>
+          <w:sz w:val="24"/>
+          <w:szCs w:val="24"/>
+        </w:rPr>
+        <w:t>9. Validaciones de Datos</w:t>
+      </w:r>
+    </w:p>
+    <w:p>
+      <w:pPr>
+        <w:pStyle w:val="Listaconvietas"/>
+        <w:jc w:val="both"/>
+        <w:rPr>
+          <w:rFonts w:ascii="Arial" w:hAnsi="Arial" w:cs="Arial"/>
+          <w:sz w:val="24"/>
+          <w:szCs w:val="24"/>
+        </w:rPr>
+      </w:pPr>
+      <w:r>
+        <w:rPr>
+          <w:rFonts w:ascii="Arial" w:hAnsi="Arial" w:cs="Arial"/>
+          <w:sz w:val="24"/>
+          <w:szCs w:val="24"/>
+        </w:rPr>
+        <w:t>Campos numéricos (capacidad, distancia, asiento, teléfono): deben ser números válidos.</w:t>
+      </w:r>
+    </w:p>
+    <w:p>
+      <w:pPr>
+        <w:pStyle w:val="Listaconvietas"/>
+        <w:jc w:val="both"/>
+        <w:rPr>
+          <w:rFonts w:ascii="Arial" w:hAnsi="Arial" w:cs="Arial"/>
+          <w:sz w:val="24"/>
+          <w:szCs w:val="24"/>
+        </w:rPr>
+      </w:pPr>
+      <w:r>
+        <w:rPr>
+          <w:rFonts w:ascii="Arial" w:hAnsi="Arial" w:cs="Arial"/>
+          <w:sz w:val="24"/>
+          <w:szCs w:val="24"/>
+        </w:rPr>
+        <w:t>Campos de fecha (</w:t>
+      </w:r>
+      <w:proofErr w:type="spellStart"/>
+      <w:r>
+        <w:rPr>
+          <w:rFonts w:ascii="Arial" w:hAnsi="Arial" w:cs="Arial"/>
+          <w:sz w:val="24"/>
+          <w:szCs w:val="24"/>
+        </w:rPr>
+        <w:t>fecha_salida</w:t>
+      </w:r>
+      <w:proofErr w:type="spellEnd"/>
+      <w:r>
+        <w:rPr>
+          <w:rFonts w:ascii="Arial" w:hAnsi="Arial" w:cs="Arial"/>
+          <w:sz w:val="24"/>
+          <w:szCs w:val="24"/>
+        </w:rPr>
+        <w:t xml:space="preserve">, </w:t>
+      </w:r>
+      <w:proofErr w:type="spellStart"/>
+      <w:r>
+        <w:rPr>
+          <w:rFonts w:ascii="Arial" w:hAnsi="Arial" w:cs="Arial"/>
+          <w:sz w:val="24"/>
+          <w:szCs w:val="24"/>
+        </w:rPr>
+        <w:t>fecha_reporte</w:t>
+      </w:r>
+      <w:proofErr w:type="spellEnd"/>
+      <w:r>
+        <w:rPr>
+          <w:rFonts w:ascii="Arial" w:hAnsi="Arial" w:cs="Arial"/>
+          <w:sz w:val="24"/>
+          <w:szCs w:val="24"/>
+        </w:rPr>
+        <w:t>): formato YYYY-MM-DD obligatorio.</w:t>
+      </w:r>
+    </w:p>
+    <w:p>
+      <w:pPr>
+        <w:pStyle w:val="Listaconvietas"/>
+        <w:jc w:val="both"/>
+        <w:rPr>
+          <w:rFonts w:ascii="Arial" w:hAnsi="Arial" w:cs="Arial"/>
+          <w:sz w:val="24"/>
+          <w:szCs w:val="24"/>
+        </w:rPr>
+      </w:pPr>
+      <w:r>
+        <w:rPr>
+          <w:rFonts w:ascii="Arial" w:hAnsi="Arial" w:cs="Arial"/>
+          <w:sz w:val="24"/>
+          <w:szCs w:val="24"/>
+        </w:rPr>
+        <w:t>Campos de texto: no pueden estar vacíos en campos críticos.</w:t>
+      </w:r>
+    </w:p>
+    <w:p>
+      <w:pPr>
+        <w:pStyle w:val="Listaconvietas"/>
+        <w:jc w:val="both"/>
+        <w:rPr>
+          <w:rFonts w:ascii="Arial" w:hAnsi="Arial" w:cs="Arial"/>
+          <w:sz w:val="24"/>
+          <w:szCs w:val="24"/>
+        </w:rPr>
+      </w:pPr>
+      <w:r>
+        <w:rPr>
+          <w:rFonts w:ascii="Arial" w:hAnsi="Arial" w:cs="Arial"/>
+          <w:sz w:val="24"/>
+          <w:szCs w:val="24"/>
+        </w:rPr>
+        <w:t>Claves foráneas: deben existir en sus tablas asociadas.</w:t>
+      </w:r>
+    </w:p>
+    <w:p>
+      <w:pPr>
+        <w:pStyle w:val="Ttulo2"/>
+        <w:jc w:val="both"/>
+        <w:rPr>
+          <w:rFonts w:ascii="Arial" w:hAnsi="Arial" w:cs="Arial"/>
+          <w:color w:val="auto"/>
+          <w:sz w:val="24"/>
+          <w:szCs w:val="24"/>
+        </w:rPr>
+      </w:pPr>
+      <w:r>
+        <w:rPr>
+          <w:rFonts w:ascii="Arial" w:hAnsi="Arial" w:cs="Arial"/>
+          <w:color w:val="auto"/>
+          <w:sz w:val="24"/>
+          <w:szCs w:val="24"/>
+        </w:rPr>
+        <w:t>10. Integridad Referencial</w:t>
+      </w:r>
+    </w:p>
+    <w:p>
+      <w:pPr>
+        <w:pStyle w:val="Listaconvietas"/>
+        <w:jc w:val="both"/>
+        <w:rPr>
+          <w:rFonts w:ascii="Arial" w:hAnsi="Arial" w:cs="Arial"/>
+          <w:sz w:val="24"/>
+          <w:szCs w:val="24"/>
+        </w:rPr>
+      </w:pPr>
+      <w:r>
+        <w:rPr>
+          <w:rFonts w:ascii="Arial" w:hAnsi="Arial" w:cs="Arial"/>
+          <w:sz w:val="24"/>
+          <w:szCs w:val="24"/>
+        </w:rPr>
+        <w:t>VIAJES → RUTAS (</w:t>
+      </w:r>
+      <w:proofErr w:type="spellStart"/>
+      <w:r>
+        <w:rPr>
+          <w:rFonts w:ascii="Arial" w:hAnsi="Arial" w:cs="Arial"/>
+          <w:sz w:val="24"/>
+          <w:szCs w:val="24"/>
+        </w:rPr>
+        <w:t>id_ruta</w:t>
+      </w:r>
+      <w:proofErr w:type="spellEnd"/>
+      <w:r>
+        <w:rPr>
+          <w:rFonts w:ascii="Arial" w:hAnsi="Arial" w:cs="Arial"/>
+          <w:sz w:val="24"/>
+          <w:szCs w:val="24"/>
+        </w:rPr>
+        <w:t>)</w:t>
+      </w:r>
+    </w:p>
+    <w:p>
+      <w:pPr>
+        <w:pStyle w:val="Listaconvietas"/>
+        <w:jc w:val="both"/>
+        <w:rPr>
+          <w:rFonts w:ascii="Arial" w:hAnsi="Arial" w:cs="Arial"/>
+          <w:sz w:val="24"/>
+          <w:szCs w:val="24"/>
+        </w:rPr>
+      </w:pPr>
+      <w:r>
+        <w:rPr>
+          <w:rFonts w:ascii="Arial" w:hAnsi="Arial" w:cs="Arial"/>
+          <w:sz w:val="24"/>
+          <w:szCs w:val="24"/>
+        </w:rPr>
+        <w:t>VIAJES → AUTOBUSES (</w:t>
+      </w:r>
+      <w:proofErr w:type="spellStart"/>
+      <w:r>
+        <w:rPr>
+          <w:rFonts w:ascii="Arial" w:hAnsi="Arial" w:cs="Arial"/>
+          <w:sz w:val="24"/>
+          <w:szCs w:val="24"/>
+        </w:rPr>
+        <w:t>id_autobus</w:t>
+      </w:r>
+      <w:proofErr w:type="spellEnd"/>
+      <w:r>
+        <w:rPr>
+          <w:rFonts w:ascii="Arial" w:hAnsi="Arial" w:cs="Arial"/>
+          <w:sz w:val="24"/>
+          <w:szCs w:val="24"/>
+        </w:rPr>
+        <w:t>)</w:t>
+      </w:r>
+    </w:p>
+    <w:p>
+      <w:pPr>
+        <w:pStyle w:val="Listaconvietas"/>
+        <w:jc w:val="both"/>
+        <w:rPr>
+          <w:rFonts w:ascii="Arial" w:hAnsi="Arial" w:cs="Arial"/>
+          <w:sz w:val="24"/>
+          <w:szCs w:val="24"/>
+        </w:rPr>
+      </w:pPr>
+      <w:r>
+        <w:rPr>
+          <w:rFonts w:ascii="Arial" w:hAnsi="Arial" w:cs="Arial"/>
+          <w:sz w:val="24"/>
+          <w:szCs w:val="24"/>
+        </w:rPr>
+        <w:t>BOLETOS → VIAJES (</w:t>
+      </w:r>
+      <w:proofErr w:type="spellStart"/>
+      <w:r>
+        <w:rPr>
+          <w:rFonts w:ascii="Arial" w:hAnsi="Arial" w:cs="Arial"/>
+          <w:sz w:val="24"/>
+          <w:szCs w:val="24"/>
+        </w:rPr>
+        <w:t>id_viaje</w:t>
+      </w:r>
+      <w:proofErr w:type="spellEnd"/>
+      <w:r>
+        <w:rPr>
+          <w:rFonts w:ascii="Arial" w:hAnsi="Arial" w:cs="Arial"/>
+          <w:sz w:val="24"/>
+          <w:szCs w:val="24"/>
+        </w:rPr>
+        <w:t>)</w:t>
+      </w:r>
+    </w:p>
+    <w:p>
+      <w:pPr>
+        <w:pStyle w:val="Listaconvietas"/>
+        <w:jc w:val="both"/>
+        <w:rPr>
+          <w:rFonts w:ascii="Arial" w:hAnsi="Arial" w:cs="Arial"/>
+          <w:sz w:val="24"/>
+          <w:szCs w:val="24"/>
+        </w:rPr>
+      </w:pPr>
+      <w:r>
+        <w:rPr>
+          <w:rFonts w:ascii="Arial" w:hAnsi="Arial" w:cs="Arial"/>
+          <w:sz w:val="24"/>
+          <w:szCs w:val="24"/>
+        </w:rPr>
+        <w:t>ADMINISTRADOR → EMPLEADOS (</w:t>
+      </w:r>
+      <w:proofErr w:type="spellStart"/>
+      <w:r>
+        <w:rPr>
+          <w:rFonts w:ascii="Arial" w:hAnsi="Arial" w:cs="Arial"/>
+          <w:sz w:val="24"/>
+          <w:szCs w:val="24"/>
+        </w:rPr>
+        <w:t>id_empleado</w:t>
+      </w:r>
+      <w:proofErr w:type="spellEnd"/>
+      <w:r>
+        <w:rPr>
+          <w:rFonts w:ascii="Arial" w:hAnsi="Arial" w:cs="Arial"/>
+          <w:sz w:val="24"/>
+          <w:szCs w:val="24"/>
+        </w:rPr>
+        <w:t>)</w:t>
+      </w:r>
+    </w:p>
+    <w:p>
+      <w:pPr>
+        <w:pStyle w:val="Listaconvietas"/>
+        <w:jc w:val="both"/>
+        <w:rPr>
+          <w:rFonts w:ascii="Arial" w:hAnsi="Arial" w:cs="Arial"/>
+          <w:sz w:val="24"/>
+          <w:szCs w:val="24"/>
+        </w:rPr>
+      </w:pPr>
+      <w:r>
+        <w:rPr>
+          <w:rFonts w:ascii="Arial" w:hAnsi="Arial" w:cs="Arial"/>
+          <w:sz w:val="24"/>
+          <w:szCs w:val="24"/>
+        </w:rPr>
+        <w:t>ACCESOS → ADMINISTRADOR (</w:t>
+      </w:r>
+      <w:proofErr w:type="spellStart"/>
+      <w:r>
+        <w:rPr>
+          <w:rFonts w:ascii="Arial" w:hAnsi="Arial" w:cs="Arial"/>
+          <w:sz w:val="24"/>
+          <w:szCs w:val="24"/>
+        </w:rPr>
+        <w:t>id_admin</w:t>
+      </w:r>
+      <w:proofErr w:type="spellEnd"/>
+      <w:r>
+        <w:rPr>
+          <w:rFonts w:ascii="Arial" w:hAnsi="Arial" w:cs="Arial"/>
+          <w:sz w:val="24"/>
+          <w:szCs w:val="24"/>
+        </w:rPr>
+        <w:t>)</w:t>
+      </w:r>
+    </w:p>
+    <w:p>
+      <w:pPr>
+        <w:pStyle w:val="Listaconvietas"/>
+        <w:jc w:val="both"/>
+        <w:rPr>
+          <w:rFonts w:ascii="Arial" w:hAnsi="Arial" w:cs="Arial"/>
+          <w:sz w:val="24"/>
+          <w:szCs w:val="24"/>
+        </w:rPr>
+      </w:pPr>
+      <w:r>
+        <w:rPr>
+          <w:rFonts w:ascii="Arial" w:hAnsi="Arial" w:cs="Arial"/>
+          <w:sz w:val="24"/>
+          <w:szCs w:val="24"/>
+        </w:rPr>
+        <w:t>REPORTES → VIAJES (</w:t>
+      </w:r>
+      <w:proofErr w:type="spellStart"/>
+      <w:r>
+        <w:rPr>
+          <w:rFonts w:ascii="Arial" w:hAnsi="Arial" w:cs="Arial"/>
+          <w:sz w:val="24"/>
+          <w:szCs w:val="24"/>
+        </w:rPr>
+        <w:t>id_viaje</w:t>
+      </w:r>
+      <w:proofErr w:type="spellEnd"/>
+      <w:r>
+        <w:rPr>
+          <w:rFonts w:ascii="Arial" w:hAnsi="Arial" w:cs="Arial"/>
+          <w:sz w:val="24"/>
+          <w:szCs w:val="24"/>
+        </w:rPr>
+        <w:t>)</w:t>
+      </w:r>
+    </w:p>
+    <w:p>
+      <w:pPr>
+        <w:pStyle w:val="Ttulo2"/>
+        <w:jc w:val="both"/>
+        <w:rPr>
+          <w:rFonts w:ascii="Arial" w:hAnsi="Arial" w:cs="Arial"/>
+          <w:color w:val="auto"/>
+          <w:sz w:val="24"/>
+          <w:szCs w:val="24"/>
+        </w:rPr>
+      </w:pPr>
+      <w:r>
+        <w:rPr>
+          <w:rFonts w:ascii="Arial" w:hAnsi="Arial" w:cs="Arial"/>
+          <w:color w:val="auto"/>
+          <w:sz w:val="24"/>
+          <w:szCs w:val="24"/>
+        </w:rPr>
+        <w:t>11. Capacidad de Asientos</w:t>
+      </w:r>
+    </w:p>
+    <w:p>
+      <w:pPr>
+        <w:pStyle w:val="Listaconvietas"/>
+        <w:jc w:val="both"/>
+        <w:rPr>
+          <w:rFonts w:ascii="Arial" w:hAnsi="Arial" w:cs="Arial"/>
+          <w:sz w:val="24"/>
+          <w:szCs w:val="24"/>
+        </w:rPr>
+      </w:pPr>
+      <w:r>
+        <w:rPr>
+          <w:rFonts w:ascii="Arial" w:hAnsi="Arial" w:cs="Arial"/>
+          <w:sz w:val="24"/>
+          <w:szCs w:val="24"/>
+        </w:rPr>
+        <w:t>No se puede reservar más boletos que la capacidad del autobús.</w:t>
+      </w:r>
+    </w:p>
+    <w:p>
+      <w:pPr>
+        <w:pStyle w:val="Listaconvietas"/>
+        <w:jc w:val="both"/>
+        <w:rPr>
+          <w:rFonts w:ascii="Arial" w:hAnsi="Arial" w:cs="Arial"/>
+          <w:sz w:val="24"/>
+          <w:szCs w:val="24"/>
+        </w:rPr>
+      </w:pPr>
+      <w:r>
+        <w:rPr>
+          <w:rFonts w:ascii="Arial" w:hAnsi="Arial" w:cs="Arial"/>
+          <w:sz w:val="24"/>
+          <w:szCs w:val="24"/>
+        </w:rPr>
+        <w:t>La disponibilidad se calcula en tiempo real.</w:t>
+      </w:r>
+    </w:p>
+    <w:p>
+      <w:pPr>
+        <w:pStyle w:val="Listaconvietas"/>
+        <w:jc w:val="both"/>
+        <w:rPr>
+          <w:rFonts w:ascii="Arial" w:hAnsi="Arial" w:cs="Arial"/>
+          <w:sz w:val="24"/>
+          <w:szCs w:val="24"/>
+        </w:rPr>
+      </w:pPr>
+      <w:r>
+        <w:rPr>
+          <w:rFonts w:ascii="Arial" w:hAnsi="Arial" w:cs="Arial"/>
+          <w:sz w:val="24"/>
+          <w:szCs w:val="24"/>
+        </w:rPr>
+        <w:t>Se muestran asientos disponibles en formato disponibles/total.</w:t>
+      </w:r>
+    </w:p>
+    <w:p>
+      <w:pPr>
+        <w:pStyle w:val="Ttulo2"/>
+        <w:jc w:val="both"/>
+        <w:rPr>
+          <w:rFonts w:ascii="Arial" w:hAnsi="Arial" w:cs="Arial"/>
+          <w:color w:val="auto"/>
+          <w:sz w:val="24"/>
+          <w:szCs w:val="24"/>
+        </w:rPr>
+      </w:pPr>
+      <w:r>
+        <w:rPr>
+          <w:rFonts w:ascii="Arial" w:hAnsi="Arial" w:cs="Arial"/>
+          <w:color w:val="auto"/>
+          <w:sz w:val="24"/>
+          <w:szCs w:val="24"/>
+        </w:rPr>
+        <w:t>12. Auditoría y Registro</w:t>
+      </w:r>
+    </w:p>
+    <w:p>
+      <w:pPr>
+        <w:pStyle w:val="Listaconvietas"/>
+        <w:jc w:val="both"/>
+        <w:rPr>
+          <w:rFonts w:ascii="Arial" w:hAnsi="Arial" w:cs="Arial"/>
+          <w:sz w:val="24"/>
+          <w:szCs w:val="24"/>
+        </w:rPr>
+      </w:pPr>
+      <w:r>
+        <w:rPr>
+          <w:rFonts w:ascii="Arial" w:hAnsi="Arial" w:cs="Arial"/>
+          <w:sz w:val="24"/>
+          <w:szCs w:val="24"/>
+        </w:rPr>
+        <w:t>El sistema mantiene registros de borrados con usuario y fecha.</w:t>
+      </w:r>
+    </w:p>
+    <w:p>
+      <w:pPr>
+        <w:pStyle w:val="Listaconvietas"/>
+        <w:jc w:val="both"/>
+        <w:rPr>
+          <w:rFonts w:ascii="Arial" w:hAnsi="Arial" w:cs="Arial"/>
+          <w:sz w:val="24"/>
+          <w:szCs w:val="24"/>
+        </w:rPr>
+      </w:pPr>
+      <w:r>
+        <w:rPr>
+          <w:rFonts w:ascii="Arial" w:hAnsi="Arial" w:cs="Arial"/>
+          <w:sz w:val="24"/>
+          <w:szCs w:val="24"/>
+        </w:rPr>
+        <w:t>Se pueden consultar registros eliminados por tabla.</w:t>
+      </w:r>
+    </w:p>
+    <w:p>
+      <w:pPr>
         <w:pStyle w:val="Ttulo1"/>
-        <w:spacing w:before="160" w:after="120"/>
-        <w:rPr>
-          <w:rFonts w:ascii="Arial" w:hAnsi="Arial" w:cs="Arial"/>
+        <w:spacing w:before="0" w:after="120"/>
+        <w:jc w:val="both"/>
+        <w:rPr>
+          <w:rFonts w:ascii="Times New Roman" w:hAnsi="Times New Roman" w:cs="Times New Roman"/>
           <w:color w:val="auto"/>
           <w:sz w:val="24"/>
           <w:szCs w:val="24"/>
@@ -2093,7 +3689,7 @@
       </w:pPr>
       <w:r>
         <w:rPr>
-          <w:rFonts w:ascii="Arial" w:hAnsi="Arial" w:cs="Arial"/>
+          <w:rFonts w:ascii="Times New Roman" w:hAnsi="Times New Roman" w:cs="Times New Roman"/>
           <w:color w:val="auto"/>
           <w:sz w:val="24"/>
           <w:szCs w:val="24"/>
@@ -2105,16 +3701,17 @@
     <w:p>
       <w:pPr>
         <w:spacing w:after="160"/>
-        <w:jc w:val="center"/>
-        <w:rPr>
-          <w:rFonts w:ascii="Arial" w:hAnsi="Arial" w:cs="Arial"/>
-          <w:sz w:val="24"/>
-          <w:szCs w:val="24"/>
-        </w:rPr>
-      </w:pPr>
-      <w:r>
-        <w:rPr>
-          <w:rFonts w:ascii="Arial" w:hAnsi="Arial" w:cs="Arial"/>
+        <w:jc w:val="both"/>
+        <w:rPr>
+          <w:rFonts w:ascii="Times New Roman" w:hAnsi="Times New Roman" w:cs="Times New Roman"/>
+          <w:sz w:val="24"/>
+          <w:szCs w:val="24"/>
+        </w:rPr>
+      </w:pPr>
+      <w:r>
+        <w:rPr>
+          <w:rFonts w:ascii="Times New Roman" w:hAnsi="Times New Roman" w:cs="Times New Roman"/>
+          <w:noProof/>
           <w:sz w:val="24"/>
           <w:szCs w:val="24"/>
         </w:rPr>
@@ -2134,7 +3731,7 @@
                     <pic:cNvPicPr/>
                   </pic:nvPicPr>
                   <pic:blipFill>
-                    <a:blip r:embed="rId16"/>
+                    <a:blip r:embed="rId20"/>
                     <a:stretch>
                       <a:fillRect/>
                     </a:stretch>
@@ -2158,9 +3755,10 @@
     <w:p>
       <w:pPr>
         <w:pStyle w:val="Ttulo1"/>
-        <w:spacing w:before="160" w:after="120"/>
-        <w:rPr>
-          <w:rFonts w:ascii="Arial" w:hAnsi="Arial" w:cs="Arial"/>
+        <w:spacing w:before="0" w:after="120"/>
+        <w:jc w:val="both"/>
+        <w:rPr>
+          <w:rFonts w:ascii="Times New Roman" w:hAnsi="Times New Roman" w:cs="Times New Roman"/>
           <w:color w:val="auto"/>
           <w:sz w:val="24"/>
           <w:szCs w:val="24"/>
@@ -2168,7 +3766,7 @@
       </w:pPr>
       <w:r>
         <w:rPr>
-          <w:rFonts w:ascii="Arial" w:hAnsi="Arial" w:cs="Arial"/>
+          <w:rFonts w:ascii="Times New Roman" w:hAnsi="Times New Roman" w:cs="Times New Roman"/>
           <w:color w:val="auto"/>
           <w:sz w:val="24"/>
           <w:szCs w:val="24"/>
@@ -2178,15 +3776,16 @@
     </w:p>
     <w:p>
       <w:pPr>
-        <w:rPr>
-          <w:rFonts w:ascii="Arial" w:hAnsi="Arial" w:cs="Arial"/>
-          <w:sz w:val="24"/>
-          <w:szCs w:val="24"/>
-        </w:rPr>
-      </w:pPr>
-      <w:r>
-        <w:rPr>
-          <w:rFonts w:ascii="Arial" w:hAnsi="Arial" w:cs="Arial"/>
+        <w:jc w:val="both"/>
+        <w:rPr>
+          <w:rFonts w:ascii="Times New Roman" w:hAnsi="Times New Roman" w:cs="Times New Roman"/>
+          <w:sz w:val="24"/>
+          <w:szCs w:val="24"/>
+        </w:rPr>
+      </w:pPr>
+      <w:r>
+        <w:rPr>
+          <w:rFonts w:ascii="Times New Roman" w:hAnsi="Times New Roman" w:cs="Times New Roman"/>
           <w:sz w:val="24"/>
           <w:szCs w:val="24"/>
         </w:rPr>
@@ -2194,7 +3793,7 @@
       </w:r>
       <w:r>
         <w:rPr>
-          <w:rFonts w:ascii="Arial" w:hAnsi="Arial" w:cs="Arial"/>
+          <w:rFonts w:ascii="Times New Roman" w:hAnsi="Times New Roman" w:cs="Times New Roman"/>
           <w:sz w:val="24"/>
           <w:szCs w:val="24"/>
         </w:rPr>
@@ -2202,7 +3801,7 @@
       </w:r>
       <w:r>
         <w:rPr>
-          <w:rFonts w:ascii="Arial" w:hAnsi="Arial" w:cs="Arial"/>
+          <w:rFonts w:ascii="Times New Roman" w:hAnsi="Times New Roman" w:cs="Times New Roman"/>
           <w:sz w:val="24"/>
           <w:szCs w:val="24"/>
         </w:rPr>
@@ -2210,7 +3809,7 @@
       </w:r>
       <w:r>
         <w:rPr>
-          <w:rFonts w:ascii="Arial" w:hAnsi="Arial" w:cs="Arial"/>
+          <w:rFonts w:ascii="Times New Roman" w:hAnsi="Times New Roman" w:cs="Times New Roman"/>
           <w:sz w:val="24"/>
           <w:szCs w:val="24"/>
         </w:rPr>
@@ -2218,7 +3817,7 @@
       </w:r>
       <w:r>
         <w:rPr>
-          <w:rFonts w:ascii="Arial" w:hAnsi="Arial" w:cs="Arial"/>
+          <w:rFonts w:ascii="Times New Roman" w:hAnsi="Times New Roman" w:cs="Times New Roman"/>
           <w:sz w:val="24"/>
           <w:szCs w:val="24"/>
         </w:rPr>
@@ -2227,15 +3826,16 @@
     </w:p>
     <w:p>
       <w:pPr>
-        <w:rPr>
-          <w:rFonts w:ascii="Arial" w:hAnsi="Arial" w:cs="Arial"/>
-          <w:sz w:val="24"/>
-          <w:szCs w:val="24"/>
-        </w:rPr>
-      </w:pPr>
-      <w:r>
-        <w:rPr>
-          <w:rFonts w:ascii="Arial" w:hAnsi="Arial" w:cs="Arial"/>
+        <w:jc w:val="both"/>
+        <w:rPr>
+          <w:rFonts w:ascii="Times New Roman" w:hAnsi="Times New Roman" w:cs="Times New Roman"/>
+          <w:sz w:val="24"/>
+          <w:szCs w:val="24"/>
+        </w:rPr>
+      </w:pPr>
+      <w:r>
+        <w:rPr>
+          <w:rFonts w:ascii="Times New Roman" w:hAnsi="Times New Roman" w:cs="Times New Roman"/>
           <w:sz w:val="24"/>
           <w:szCs w:val="24"/>
         </w:rPr>
@@ -2243,7 +3843,7 @@
       </w:r>
       <w:r>
         <w:rPr>
-          <w:rFonts w:ascii="Arial" w:hAnsi="Arial" w:cs="Arial"/>
+          <w:rFonts w:ascii="Times New Roman" w:hAnsi="Times New Roman" w:cs="Times New Roman"/>
           <w:sz w:val="24"/>
           <w:szCs w:val="24"/>
         </w:rPr>
@@ -2251,7 +3851,7 @@
       </w:r>
       <w:r>
         <w:rPr>
-          <w:rFonts w:ascii="Arial" w:hAnsi="Arial" w:cs="Arial"/>
+          <w:rFonts w:ascii="Times New Roman" w:hAnsi="Times New Roman" w:cs="Times New Roman"/>
           <w:sz w:val="24"/>
           <w:szCs w:val="24"/>
         </w:rPr>
@@ -2259,7 +3859,7 @@
       </w:r>
       <w:r>
         <w:rPr>
-          <w:rFonts w:ascii="Arial" w:hAnsi="Arial" w:cs="Arial"/>
+          <w:rFonts w:ascii="Times New Roman" w:hAnsi="Times New Roman" w:cs="Times New Roman"/>
           <w:sz w:val="24"/>
           <w:szCs w:val="24"/>
         </w:rPr>
@@ -2267,7 +3867,7 @@
       </w:r>
       <w:r>
         <w:rPr>
-          <w:rFonts w:ascii="Arial" w:hAnsi="Arial" w:cs="Arial"/>
+          <w:rFonts w:ascii="Times New Roman" w:hAnsi="Times New Roman" w:cs="Times New Roman"/>
           <w:sz w:val="24"/>
           <w:szCs w:val="24"/>
         </w:rPr>
@@ -2277,9 +3877,10 @@
     <w:p>
       <w:pPr>
         <w:pStyle w:val="Ttulo1"/>
-        <w:spacing w:before="160" w:after="120"/>
-        <w:rPr>
-          <w:rFonts w:ascii="Arial" w:hAnsi="Arial" w:cs="Arial"/>
+        <w:spacing w:before="0" w:after="120"/>
+        <w:jc w:val="both"/>
+        <w:rPr>
+          <w:rFonts w:ascii="Times New Roman" w:hAnsi="Times New Roman" w:cs="Times New Roman"/>
           <w:color w:val="auto"/>
           <w:sz w:val="24"/>
           <w:szCs w:val="24"/>
@@ -2287,43 +3888,26 @@
       </w:pPr>
       <w:r>
         <w:rPr>
-          <w:rFonts w:ascii="Arial" w:hAnsi="Arial" w:cs="Arial"/>
+          <w:rFonts w:ascii="Times New Roman" w:hAnsi="Times New Roman" w:cs="Times New Roman"/>
           <w:color w:val="auto"/>
           <w:sz w:val="24"/>
           <w:szCs w:val="24"/>
         </w:rPr>
-        <w:t>Bibliografía</w:t>
-      </w:r>
-      <w:r>
-        <w:rPr>
-          <w:rFonts w:ascii="Arial" w:hAnsi="Arial" w:cs="Arial"/>
-          <w:color w:val="auto"/>
-          <w:sz w:val="24"/>
-          <w:szCs w:val="24"/>
-        </w:rPr>
-        <w:t xml:space="preserve"> / fuentes de </w:t>
-      </w:r>
-      <w:r>
-        <w:rPr>
-          <w:rFonts w:ascii="Arial" w:hAnsi="Arial" w:cs="Arial"/>
-          <w:color w:val="auto"/>
-          <w:sz w:val="24"/>
-          <w:szCs w:val="24"/>
-        </w:rPr>
-        <w:t>información</w:t>
+        <w:t>Bibliografía / fuentes de información</w:t>
       </w:r>
     </w:p>
     <w:p>
       <w:pPr>
-        <w:rPr>
-          <w:rFonts w:ascii="Arial" w:hAnsi="Arial" w:cs="Arial"/>
-          <w:sz w:val="24"/>
-          <w:szCs w:val="24"/>
-        </w:rPr>
-      </w:pPr>
-      <w:r>
-        <w:rPr>
-          <w:rFonts w:ascii="Arial" w:hAnsi="Arial" w:cs="Arial"/>
+        <w:jc w:val="both"/>
+        <w:rPr>
+          <w:rFonts w:ascii="Times New Roman" w:hAnsi="Times New Roman" w:cs="Times New Roman"/>
+          <w:sz w:val="24"/>
+          <w:szCs w:val="24"/>
+        </w:rPr>
+      </w:pPr>
+      <w:r>
+        <w:rPr>
+          <w:rFonts w:ascii="Times New Roman" w:hAnsi="Times New Roman" w:cs="Times New Roman"/>
           <w:sz w:val="24"/>
           <w:szCs w:val="24"/>
         </w:rPr>
@@ -2331,7 +3915,7 @@
       </w:r>
       <w:r>
         <w:rPr>
-          <w:rFonts w:ascii="Arial" w:hAnsi="Arial" w:cs="Arial"/>
+          <w:rFonts w:ascii="Times New Roman" w:hAnsi="Times New Roman" w:cs="Times New Roman"/>
           <w:sz w:val="24"/>
           <w:szCs w:val="24"/>
         </w:rPr>
@@ -2339,7 +3923,7 @@
       </w:r>
       <w:r>
         <w:rPr>
-          <w:rFonts w:ascii="Arial" w:hAnsi="Arial" w:cs="Arial"/>
+          <w:rFonts w:ascii="Times New Roman" w:hAnsi="Times New Roman" w:cs="Times New Roman"/>
           <w:sz w:val="24"/>
           <w:szCs w:val="24"/>
         </w:rPr>
@@ -2347,7 +3931,7 @@
       </w:r>
       <w:r>
         <w:rPr>
-          <w:rFonts w:ascii="Arial" w:hAnsi="Arial" w:cs="Arial"/>
+          <w:rFonts w:ascii="Times New Roman" w:hAnsi="Times New Roman" w:cs="Times New Roman"/>
           <w:sz w:val="24"/>
           <w:szCs w:val="24"/>
         </w:rPr>
@@ -2355,7 +3939,7 @@
       </w:r>
       <w:r>
         <w:rPr>
-          <w:rFonts w:ascii="Arial" w:hAnsi="Arial" w:cs="Arial"/>
+          <w:rFonts w:ascii="Times New Roman" w:hAnsi="Times New Roman" w:cs="Times New Roman"/>
           <w:sz w:val="24"/>
           <w:szCs w:val="24"/>
         </w:rPr>
@@ -2363,7 +3947,7 @@
       </w:r>
       <w:r>
         <w:rPr>
-          <w:rFonts w:ascii="Arial" w:hAnsi="Arial" w:cs="Arial"/>
+          <w:rFonts w:ascii="Times New Roman" w:hAnsi="Times New Roman" w:cs="Times New Roman"/>
           <w:sz w:val="24"/>
           <w:szCs w:val="24"/>
         </w:rPr>
@@ -2371,7 +3955,7 @@
       </w:r>
       <w:r>
         <w:rPr>
-          <w:rFonts w:ascii="Arial" w:hAnsi="Arial" w:cs="Arial"/>
+          <w:rFonts w:ascii="Times New Roman" w:hAnsi="Times New Roman" w:cs="Times New Roman"/>
           <w:sz w:val="24"/>
           <w:szCs w:val="24"/>
         </w:rPr>
@@ -2424,6 +4008,16 @@
   <w:p>
     <w:pPr>
       <w:pStyle w:val="Piedepgina"/>
+    </w:pPr>
+  </w:p>
+</w:ftr>
+</file>
+
+<file path=word/footer2.xml><?xml version="1.0" encoding="utf-8"?>
+<w:ftr xmlns:wpc="http://schemas.microsoft.com/office/word/2010/wordprocessingCanvas" xmlns:cx="http://schemas.microsoft.com/office/drawing/2014/chartex" xmlns:cx1="http://schemas.microsoft.com/office/drawing/2015/9/8/chartex" xmlns:cx2="http://schemas.microsoft.com/office/drawing/2015/10/21/chartex" xmlns:cx3="http://schemas.microsoft.com/office/drawing/2016/5/9/chartex" xmlns:cx4="http://schemas.microsoft.com/office/drawing/2016/5/10/chartex" xmlns:cx5="http://schemas.microsoft.com/office/drawing/2016/5/11/chartex" xmlns:cx6="http://schemas.microsoft.com/office/drawing/2016/5/12/chartex" xmlns:cx7="http://schemas.microsoft.com/office/drawing/2016/5/13/chartex" xmlns:cx8="http://schemas.microsoft.com/office/drawing/2016/5/14/chartex" xmlns:mc="http://schemas.openxmlformats.org/markup-compatibility/2006" xmlns:aink="http://schemas.microsoft.com/office/drawing/2016/ink" xmlns:am3d="http://schemas.microsoft.com/office/drawing/2017/model3d" xmlns:o="urn:schemas-microsoft-com:office:office" xmlns:oel="http://schemas.microsoft.com/office/2019/extlst" xmlns:r="http://schemas.openxmlformats.org/officeDocument/2006/relationships" xmlns:m="http://schemas.openxmlformats.org/officeDocument/2006/math" xmlns:v="urn:schemas-microsoft-com:vml" xmlns:wp14="http://schemas.microsoft.com/office/word/2010/wordprocessingDrawing" xmlns:wp="http://schemas.openxmlformats.org/drawingml/2006/wordprocessingDrawing" xmlns:w10="urn:schemas-microsoft-com:office:word" xmlns:w="http://schemas.openxmlformats.org/wordprocessingml/2006/main" xmlns:w14="http://schemas.microsoft.com/office/word/2010/wordml" xmlns:w15="http://schemas.microsoft.com/office/word/2012/wordml" xmlns:w16cex="http://schemas.microsoft.com/office/word/2018/wordml/cex" xmlns:w16cid="http://schemas.microsoft.com/office/word/2016/wordml/cid" xmlns:w16="http://schemas.microsoft.com/office/word/2018/wordml" xmlns:w16du="http://schemas.microsoft.com/office/word/2023/wordml/word16du" xmlns:w16sdtdh="http://schemas.microsoft.com/office/word/2020/wordml/sdtdatahash" xmlns:w16sdtfl="http://schemas.microsoft.com/office/word/2024/wordml/sdtformatlock" xmlns:w16se="http://schemas.microsoft.com/office/word/2015/wordml/symex" xmlns:wpg="http://schemas.microsoft.com/office/word/2010/wordprocessingGroup" xmlns:wpi="http://schemas.microsoft.com/office/word/2010/wordprocessingInk" xmlns:wne="http://schemas.microsoft.com/office/word/2006/wordml" xmlns:wps="http://schemas.microsoft.com/office/word/2010/wordprocessingShape" mc:Ignorable="w14 w15 w16se w16cid w16 w16cex w16sdtdh w16sdtfl w16du wp14">
+  <w:p>
+    <w:pPr>
+      <w:pStyle w:val="Piedepgina"/>
       <w:jc w:val="center"/>
     </w:pPr>
     <w:r>
@@ -2445,8 +4039,27 @@
         <w:color w:val="666666"/>
         <w:sz w:val="17"/>
       </w:rPr>
-      <w:t xml:space="preserve"> tecnica</w:t>
+      <w:t xml:space="preserve"> </w:t>
     </w:r>
+    <w:proofErr w:type="spellStart"/>
+    <w:r>
+      <w:rPr>
+        <w:color w:val="666666"/>
+        <w:sz w:val="17"/>
+      </w:rPr>
+      <w:t>tecnica</w:t>
+    </w:r>
+    <w:proofErr w:type="spellEnd"/>
+  </w:p>
+</w:ftr>
+</file>
+
+<file path=word/footer3.xml><?xml version="1.0" encoding="utf-8"?>
+<w:ftr xmlns:wpc="http://schemas.microsoft.com/office/word/2010/wordprocessingCanvas" xmlns:cx="http://schemas.microsoft.com/office/drawing/2014/chartex" xmlns:cx1="http://schemas.microsoft.com/office/drawing/2015/9/8/chartex" xmlns:cx2="http://schemas.microsoft.com/office/drawing/2015/10/21/chartex" xmlns:cx3="http://schemas.microsoft.com/office/drawing/2016/5/9/chartex" xmlns:cx4="http://schemas.microsoft.com/office/drawing/2016/5/10/chartex" xmlns:cx5="http://schemas.microsoft.com/office/drawing/2016/5/11/chartex" xmlns:cx6="http://schemas.microsoft.com/office/drawing/2016/5/12/chartex" xmlns:cx7="http://schemas.microsoft.com/office/drawing/2016/5/13/chartex" xmlns:cx8="http://schemas.microsoft.com/office/drawing/2016/5/14/chartex" xmlns:mc="http://schemas.openxmlformats.org/markup-compatibility/2006" xmlns:aink="http://schemas.microsoft.com/office/drawing/2016/ink" xmlns:am3d="http://schemas.microsoft.com/office/drawing/2017/model3d" xmlns:o="urn:schemas-microsoft-com:office:office" xmlns:oel="http://schemas.microsoft.com/office/2019/extlst" xmlns:r="http://schemas.openxmlformats.org/officeDocument/2006/relationships" xmlns:m="http://schemas.openxmlformats.org/officeDocument/2006/math" xmlns:v="urn:schemas-microsoft-com:vml" xmlns:wp14="http://schemas.microsoft.com/office/word/2010/wordprocessingDrawing" xmlns:wp="http://schemas.openxmlformats.org/drawingml/2006/wordprocessingDrawing" xmlns:w10="urn:schemas-microsoft-com:office:word" xmlns:w="http://schemas.openxmlformats.org/wordprocessingml/2006/main" xmlns:w14="http://schemas.microsoft.com/office/word/2010/wordml" xmlns:w15="http://schemas.microsoft.com/office/word/2012/wordml" xmlns:w16cex="http://schemas.microsoft.com/office/word/2018/wordml/cex" xmlns:w16cid="http://schemas.microsoft.com/office/word/2016/wordml/cid" xmlns:w16="http://schemas.microsoft.com/office/word/2018/wordml" xmlns:w16du="http://schemas.microsoft.com/office/word/2023/wordml/word16du" xmlns:w16sdtdh="http://schemas.microsoft.com/office/word/2020/wordml/sdtdatahash" xmlns:w16sdtfl="http://schemas.microsoft.com/office/word/2024/wordml/sdtformatlock" xmlns:w16se="http://schemas.microsoft.com/office/word/2015/wordml/symex" xmlns:wpg="http://schemas.microsoft.com/office/word/2010/wordprocessingGroup" xmlns:wpi="http://schemas.microsoft.com/office/word/2010/wordprocessingInk" xmlns:wne="http://schemas.microsoft.com/office/word/2006/wordml" xmlns:wps="http://schemas.microsoft.com/office/word/2010/wordprocessingShape" mc:Ignorable="w14 w15 w16se w16cid w16 w16cex w16sdtdh w16sdtfl w16du wp14">
+  <w:p>
+    <w:pPr>
+      <w:pStyle w:val="Piedepgina"/>
+    </w:pPr>
   </w:p>
 </w:ftr>
 </file>
@@ -2477,6 +4090,16 @@
 </file>
 
 <file path=word/header1.xml><?xml version="1.0" encoding="utf-8"?>
+<w:hdr xmlns:wpc="http://schemas.microsoft.com/office/word/2010/wordprocessingCanvas" xmlns:cx="http://schemas.microsoft.com/office/drawing/2014/chartex" xmlns:cx1="http://schemas.microsoft.com/office/drawing/2015/9/8/chartex" xmlns:cx2="http://schemas.microsoft.com/office/drawing/2015/10/21/chartex" xmlns:cx3="http://schemas.microsoft.com/office/drawing/2016/5/9/chartex" xmlns:cx4="http://schemas.microsoft.com/office/drawing/2016/5/10/chartex" xmlns:cx5="http://schemas.microsoft.com/office/drawing/2016/5/11/chartex" xmlns:cx6="http://schemas.microsoft.com/office/drawing/2016/5/12/chartex" xmlns:cx7="http://schemas.microsoft.com/office/drawing/2016/5/13/chartex" xmlns:cx8="http://schemas.microsoft.com/office/drawing/2016/5/14/chartex" xmlns:mc="http://schemas.openxmlformats.org/markup-compatibility/2006" xmlns:aink="http://schemas.microsoft.com/office/drawing/2016/ink" xmlns:am3d="http://schemas.microsoft.com/office/drawing/2017/model3d" xmlns:o="urn:schemas-microsoft-com:office:office" xmlns:oel="http://schemas.microsoft.com/office/2019/extlst" xmlns:r="http://schemas.openxmlformats.org/officeDocument/2006/relationships" xmlns:m="http://schemas.openxmlformats.org/officeDocument/2006/math" xmlns:v="urn:schemas-microsoft-com:vml" xmlns:wp14="http://schemas.microsoft.com/office/word/2010/wordprocessingDrawing" xmlns:wp="http://schemas.openxmlformats.org/drawingml/2006/wordprocessingDrawing" xmlns:w10="urn:schemas-microsoft-com:office:word" xmlns:w="http://schemas.openxmlformats.org/wordprocessingml/2006/main" xmlns:w14="http://schemas.microsoft.com/office/word/2010/wordml" xmlns:w15="http://schemas.microsoft.com/office/word/2012/wordml" xmlns:w16cex="http://schemas.microsoft.com/office/word/2018/wordml/cex" xmlns:w16cid="http://schemas.microsoft.com/office/word/2016/wordml/cid" xmlns:w16="http://schemas.microsoft.com/office/word/2018/wordml" xmlns:w16du="http://schemas.microsoft.com/office/word/2023/wordml/word16du" xmlns:w16sdtdh="http://schemas.microsoft.com/office/word/2020/wordml/sdtdatahash" xmlns:w16sdtfl="http://schemas.microsoft.com/office/word/2024/wordml/sdtformatlock" xmlns:w16se="http://schemas.microsoft.com/office/word/2015/wordml/symex" xmlns:wpg="http://schemas.microsoft.com/office/word/2010/wordprocessingGroup" xmlns:wpi="http://schemas.microsoft.com/office/word/2010/wordprocessingInk" xmlns:wne="http://schemas.microsoft.com/office/word/2006/wordml" xmlns:wps="http://schemas.microsoft.com/office/word/2010/wordprocessingShape" mc:Ignorable="w14 w15 w16se w16cid w16 w16cex w16sdtdh w16sdtfl w16du wp14">
+  <w:p>
+    <w:pPr>
+      <w:pStyle w:val="Encabezado"/>
+    </w:pPr>
+  </w:p>
+</w:hdr>
+</file>
+
+<file path=word/header2.xml><?xml version="1.0" encoding="utf-8"?>
 <w:hdr xmlns:wpc="http://schemas.microsoft.com/office/word/2010/wordprocessingCanvas" xmlns:cx="http://schemas.microsoft.com/office/drawing/2014/chartex" xmlns:cx1="http://schemas.microsoft.com/office/drawing/2015/9/8/chartex" xmlns:cx2="http://schemas.microsoft.com/office/drawing/2015/10/21/chartex" xmlns:cx3="http://schemas.microsoft.com/office/drawing/2016/5/9/chartex" xmlns:cx4="http://schemas.microsoft.com/office/drawing/2016/5/10/chartex" xmlns:cx5="http://schemas.microsoft.com/office/drawing/2016/5/11/chartex" xmlns:cx6="http://schemas.microsoft.com/office/drawing/2016/5/12/chartex" xmlns:cx7="http://schemas.microsoft.com/office/drawing/2016/5/13/chartex" xmlns:cx8="http://schemas.microsoft.com/office/drawing/2016/5/14/chartex" xmlns:mc="http://schemas.openxmlformats.org/markup-compatibility/2006" xmlns:aink="http://schemas.microsoft.com/office/drawing/2016/ink" xmlns:am3d="http://schemas.microsoft.com/office/drawing/2017/model3d" xmlns:o="urn:schemas-microsoft-com:office:office" xmlns:oel="http://schemas.microsoft.com/office/2019/extlst" xmlns:r="http://schemas.openxmlformats.org/officeDocument/2006/relationships" xmlns:m="http://schemas.openxmlformats.org/officeDocument/2006/math" xmlns:v="urn:schemas-microsoft-com:vml" xmlns:wp14="http://schemas.microsoft.com/office/word/2010/wordprocessingDrawing" xmlns:wp="http://schemas.openxmlformats.org/drawingml/2006/wordprocessingDrawing" xmlns:w10="urn:schemas-microsoft-com:office:word" xmlns:w="http://schemas.openxmlformats.org/wordprocessingml/2006/main" xmlns:w14="http://schemas.microsoft.com/office/word/2010/wordml" xmlns:w15="http://schemas.microsoft.com/office/word/2012/wordml" xmlns:w16cex="http://schemas.microsoft.com/office/word/2018/wordml/cex" xmlns:w16cid="http://schemas.microsoft.com/office/word/2016/wordml/cid" xmlns:w16="http://schemas.microsoft.com/office/word/2018/wordml" xmlns:w16du="http://schemas.microsoft.com/office/word/2023/wordml/word16du" xmlns:w16sdtdh="http://schemas.microsoft.com/office/word/2020/wordml/sdtdatahash" xmlns:w16sdtfl="http://schemas.microsoft.com/office/word/2024/wordml/sdtformatlock" xmlns:w16se="http://schemas.microsoft.com/office/word/2015/wordml/symex" xmlns:wpg="http://schemas.microsoft.com/office/word/2010/wordprocessingGroup" xmlns:wpi="http://schemas.microsoft.com/office/word/2010/wordprocessingInk" xmlns:wne="http://schemas.microsoft.com/office/word/2006/wordml" xmlns:wps="http://schemas.microsoft.com/office/word/2010/wordprocessingShape" mc:Ignorable="w14 w15 w16se w16cid w16 w16cex w16sdtdh w16sdtfl w16du wp14">
   <w:p>
     <w:pPr>
@@ -2560,7 +4183,7 @@
         <w:noProof/>
       </w:rPr>
       <w:drawing>
-        <wp:anchor distT="0" distB="0" distL="114300" distR="114300" simplePos="0" relativeHeight="251659264" behindDoc="0" locked="0" layoutInCell="1" allowOverlap="1" wp14:anchorId="159FC3D5" wp14:editId="024CC671">
+        <wp:anchor distT="0" distB="0" distL="114300" distR="114300" simplePos="0" relativeHeight="251660288" behindDoc="0" locked="0" layoutInCell="1" allowOverlap="1" wp14:anchorId="159FC3D5" wp14:editId="024CC671">
           <wp:simplePos x="0" y="0"/>
           <wp:positionH relativeFrom="column">
             <wp:posOffset>5124450</wp:posOffset>
@@ -2626,6 +4249,16 @@
 </w:hdr>
 </file>
 
+<file path=word/header3.xml><?xml version="1.0" encoding="utf-8"?>
+<w:hdr xmlns:wpc="http://schemas.microsoft.com/office/word/2010/wordprocessingCanvas" xmlns:cx="http://schemas.microsoft.com/office/drawing/2014/chartex" xmlns:cx1="http://schemas.microsoft.com/office/drawing/2015/9/8/chartex" xmlns:cx2="http://schemas.microsoft.com/office/drawing/2015/10/21/chartex" xmlns:cx3="http://schemas.microsoft.com/office/drawing/2016/5/9/chartex" xmlns:cx4="http://schemas.microsoft.com/office/drawing/2016/5/10/chartex" xmlns:cx5="http://schemas.microsoft.com/office/drawing/2016/5/11/chartex" xmlns:cx6="http://schemas.microsoft.com/office/drawing/2016/5/12/chartex" xmlns:cx7="http://schemas.microsoft.com/office/drawing/2016/5/13/chartex" xmlns:cx8="http://schemas.microsoft.com/office/drawing/2016/5/14/chartex" xmlns:mc="http://schemas.openxmlformats.org/markup-compatibility/2006" xmlns:aink="http://schemas.microsoft.com/office/drawing/2016/ink" xmlns:am3d="http://schemas.microsoft.com/office/drawing/2017/model3d" xmlns:o="urn:schemas-microsoft-com:office:office" xmlns:oel="http://schemas.microsoft.com/office/2019/extlst" xmlns:r="http://schemas.openxmlformats.org/officeDocument/2006/relationships" xmlns:m="http://schemas.openxmlformats.org/officeDocument/2006/math" xmlns:v="urn:schemas-microsoft-com:vml" xmlns:wp14="http://schemas.microsoft.com/office/word/2010/wordprocessingDrawing" xmlns:wp="http://schemas.openxmlformats.org/drawingml/2006/wordprocessingDrawing" xmlns:w10="urn:schemas-microsoft-com:office:word" xmlns:w="http://schemas.openxmlformats.org/wordprocessingml/2006/main" xmlns:w14="http://schemas.microsoft.com/office/word/2010/wordml" xmlns:w15="http://schemas.microsoft.com/office/word/2012/wordml" xmlns:w16cex="http://schemas.microsoft.com/office/word/2018/wordml/cex" xmlns:w16cid="http://schemas.microsoft.com/office/word/2016/wordml/cid" xmlns:w16="http://schemas.microsoft.com/office/word/2018/wordml" xmlns:w16du="http://schemas.microsoft.com/office/word/2023/wordml/word16du" xmlns:w16sdtdh="http://schemas.microsoft.com/office/word/2020/wordml/sdtdatahash" xmlns:w16sdtfl="http://schemas.microsoft.com/office/word/2024/wordml/sdtformatlock" xmlns:w16se="http://schemas.microsoft.com/office/word/2015/wordml/symex" xmlns:wpg="http://schemas.microsoft.com/office/word/2010/wordprocessingGroup" xmlns:wpi="http://schemas.microsoft.com/office/word/2010/wordprocessingInk" xmlns:wne="http://schemas.microsoft.com/office/word/2006/wordml" xmlns:wps="http://schemas.microsoft.com/office/word/2010/wordprocessingShape" mc:Ignorable="w14 w15 w16se w16cid w16 w16cex w16sdtdh w16sdtfl w16du wp14">
+  <w:p>
+    <w:pPr>
+      <w:pStyle w:val="Encabezado"/>
+    </w:pPr>
+  </w:p>
+</w:hdr>
+</file>
+
 <file path=word/numbering.xml><?xml version="1.0" encoding="utf-8"?>
 <w:numbering xmlns:wpc="http://schemas.microsoft.com/office/word/2010/wordprocessingCanvas" xmlns:cx="http://schemas.microsoft.com/office/drawing/2014/chartex" xmlns:cx1="http://schemas.microsoft.com/office/drawing/2015/9/8/chartex" xmlns:cx2="http://schemas.microsoft.com/office/drawing/2015/10/21/chartex" xmlns:cx3="http://schemas.microsoft.com/office/drawing/2016/5/9/chartex" xmlns:cx4="http://schemas.microsoft.com/office/drawing/2016/5/10/chartex" xmlns:cx5="http://schemas.microsoft.com/office/drawing/2016/5/11/chartex" xmlns:cx6="http://schemas.microsoft.com/office/drawing/2016/5/12/chartex" xmlns:cx7="http://schemas.microsoft.com/office/drawing/2016/5/13/chartex" xmlns:cx8="http://schemas.microsoft.com/office/drawing/2016/5/14/chartex" xmlns:mc="http://schemas.openxmlformats.org/markup-compatibility/2006" xmlns:aink="http://schemas.microsoft.com/office/drawing/2016/ink" xmlns:am3d="http://schemas.microsoft.com/office/drawing/2017/model3d" xmlns:o="urn:schemas-microsoft-com:office:office" xmlns:oel="http://schemas.microsoft.com/office/2019/extlst" xmlns:r="http://schemas.openxmlformats.org/officeDocument/2006/relationships" xmlns:m="http://schemas.openxmlformats.org/officeDocument/2006/math" xmlns:v="urn:schemas-microsoft-com:vml" xmlns:wp14="http://schemas.microsoft.com/office/word/2010/wordprocessingDrawing" xmlns:wp="http://schemas.openxmlformats.org/drawingml/2006/wordprocessingDrawing" xmlns:w10="urn:schemas-microsoft-com:office:word" xmlns:w="http://schemas.openxmlformats.org/wordprocessingml/2006/main" xmlns:w14="http://schemas.microsoft.com/office/word/2010/wordml" xmlns:w15="http://schemas.microsoft.com/office/word/2012/wordml" xmlns:w16cex="http://schemas.microsoft.com/office/word/2018/wordml/cex" xmlns:w16cid="http://schemas.microsoft.com/office/word/2016/wordml/cid" xmlns:w16="http://schemas.microsoft.com/office/word/2018/wordml" xmlns:w16du="http://schemas.microsoft.com/office/word/2023/wordml/word16du" xmlns:w16sdtdh="http://schemas.microsoft.com/office/word/2020/wordml/sdtdatahash" xmlns:w16sdtfl="http://schemas.microsoft.com/office/word/2024/wordml/sdtformatlock" xmlns:w16se="http://schemas.microsoft.com/office/word/2015/wordml/symex" xmlns:wpg="http://schemas.microsoft.com/office/word/2010/wordprocessingGroup" xmlns:wpi="http://schemas.microsoft.com/office/word/2010/wordprocessingInk" xmlns:wne="http://schemas.microsoft.com/office/word/2006/wordml" xmlns:wps="http://schemas.microsoft.com/office/word/2010/wordprocessingShape" mc:Ignorable="w14 w15 w16se w16cid w16 w16cex w16sdtdh w16sdtfl w16du wp14">
   <w:abstractNum w:abstractNumId="0" w15:restartNumberingAfterBreak="0">
@@ -2763,7 +4396,7 @@
   <w:abstractNum w:abstractNumId="7" w15:restartNumberingAfterBreak="0">
     <w:nsid w:val="FFFFFF88"/>
     <w:multiLevelType w:val="singleLevel"/>
-    <w:tmpl w:val="D0A62B40"/>
+    <w:tmpl w:val="01C2AD5C"/>
     <w:lvl w:ilvl="0">
       <w:start w:val="1"/>
       <w:numFmt w:val="decimal"/>
@@ -2825,6 +4458,9 @@
   </w:num>
   <w:num w:numId="9" w16cid:durableId="1974629298">
     <w:abstractNumId w:val="0"/>
+  </w:num>
+  <w:num w:numId="10" w16cid:durableId="284699773">
+    <w:abstractNumId w:val="7"/>
   </w:num>
 </w:numbering>
 </file>
@@ -14533,6 +16169,43 @@
 </a:theme>
 </file>
 
+<file path=word/webextensions/taskpanes.xml><?xml version="1.0" encoding="utf-8"?>
+<wetp:taskpanes xmlns:wetp="http://schemas.microsoft.com/office/webextensions/taskpanes/2010/11">
+  <wetp:taskpane dockstate="right" visibility="0" width="525" row="1">
+    <wetp:webextensionref xmlns:r="http://schemas.openxmlformats.org/officeDocument/2006/relationships" r:id="rId1"/>
+  </wetp:taskpane>
+  <wetp:taskpane dockstate="right" visibility="0" width="525" row="2">
+    <wetp:webextensionref xmlns:r="http://schemas.openxmlformats.org/officeDocument/2006/relationships" r:id="rId2"/>
+  </wetp:taskpane>
+</wetp:taskpanes>
+</file>
+
+<file path=word/webextensions/webextension1.xml><?xml version="1.0" encoding="utf-8"?>
+<we:webextension xmlns:we="http://schemas.microsoft.com/office/webextensions/webextension/2010/11" id="{557701FA-FD06-436D-A136-17829EF4BA33}">
+  <we:reference id="wa200010453" version="1.0.0.1" store="es-ES" storeType="OMEX"/>
+  <we:alternateReferences>
+    <we:reference id="WA200010453" version="1.0.0.1" store="WA200010453" storeType="OMEX"/>
+  </we:alternateReferences>
+  <we:properties>
+    <we:property name="claude.fileId" value="&quot;e61266a9-4dd6-48ac-8a9b-4d75ecb38502&quot;"/>
+  </we:properties>
+  <we:bindings/>
+  <we:snapshot xmlns:r="http://schemas.openxmlformats.org/officeDocument/2006/relationships"/>
+</we:webextension>
+</file>
+
+<file path=word/webextensions/webextension2.xml><?xml version="1.0" encoding="utf-8"?>
+<we:webextension xmlns:we="http://schemas.microsoft.com/office/webextensions/webextension/2010/11" id="{0486346A-82E9-40CF-8F1E-9C022E8C2EC7}">
+  <we:reference id="WA200008397" version="1.1.4.0" store="Omex" storeType="OMEX"/>
+  <we:alternateReferences>
+    <we:reference id="WA200008397" version="1.1.4.0" store="WA200008397" storeType="OMEX"/>
+  </we:alternateReferences>
+  <we:properties/>
+  <we:bindings/>
+  <we:snapshot xmlns:r="http://schemas.openxmlformats.org/officeDocument/2006/relationships"/>
+</we:webextension>
+</file>
+
 <file path=customXml/item1.xml><?xml version="1.0" encoding="utf-8"?>
 <b:Sources xmlns:b="http://schemas.openxmlformats.org/officeDocument/2006/bibliography" xmlns="http://schemas.openxmlformats.org/officeDocument/2006/bibliography" SelectedStyle="/APA.XSL" StyleName="APA"/>
 </file>

</xml_diff>